<commit_message>
docs: atualiza PRAXIS com UC21 (custo de vida) e UC22 (graficos)
Documenta as duas funcionalidades dos commits anteriores: UC21 - Custo
de Vida do Animal, e UC22 - Graficos de Ocupacao e Distribuicao, no
mesmo formato das demais especificacoes de caso de uso ja existentes no
documento.

Co-Authored-By: Claude Sonnet 5 <noreply@anthropic.com>
</commit_message>
<xml_diff>
--- a/Arquivos Projeto/PRAXIS (v.2.1 - Atualizado).docx
+++ b/Arquivos Projeto/PRAXIS (v.2.1 - Atualizado).docx
@@ -33542,6 +33542,3780 @@
     </w:p>
     <w:p>
       <w:pPr>
+        <w:pStyle w:val="Heading2"/>
+        <w:spacing w:after="160" w:before="280"/>
+      </w:pPr>
+      <w:r>
+        <w:t xml:space="preserve">Especificação do caso de uso UC21: Custo de Vida do Animal</w:t>
+      </w:r>
+    </w:p>
+    <w:p>
+      <w:pPr>
+        <w:spacing w:after="160"/>
+      </w:pPr>
+      <w:r>
+        <w:rPr>
+          <w:i/>
+          <w:iCs/>
+        </w:rPr>
+        <w:t xml:space="preserve">(Módulo novo — não existia no documento v2.1.)</w:t>
+      </w:r>
+    </w:p>
+    <w:p>
+      <w:pPr>
+        <w:spacing w:after="160"/>
+      </w:pPr>
+      <w:r>
+        <w:rPr>
+          <w:b/>
+          <w:bCs/>
+        </w:rPr>
+        <w:t xml:space="preserve">Interface de Usuário: Animais → Detalhes do Animal (seção "Custo de vida") e Lotes → Detalhes do Lote (seção "Custo total do lote")</w:t>
+      </w:r>
+    </w:p>
+    <w:p>
+      <w:pPr>
+        <w:spacing w:after="160"/>
+      </w:pPr>
+      <w:r>
+        <w:rPr>
+          <w:b/>
+          <w:bCs/>
+        </w:rPr>
+        <w:t xml:space="preserve">Layout Sugerido</w:t>
+      </w:r>
+    </w:p>
+    <w:p>
+      <w:pPr>
+        <w:spacing w:after="160"/>
+      </w:pPr>
+      <w:r>
+        <w:rPr>
+          <w:i/>
+          <w:iCs/>
+        </w:rPr>
+        <w:t xml:space="preserve">(placeholder de layout)</w:t>
+      </w:r>
+    </w:p>
+    <w:p>
+      <w:pPr>
+        <w:spacing w:after="160"/>
+      </w:pPr>
+      <w:r>
+        <w:rPr>
+          <w:b/>
+          <w:bCs/>
+        </w:rPr>
+        <w:t xml:space="preserve">Relacionamento com outras interfaces</w:t>
+      </w:r>
+    </w:p>
+    <w:p>
+      <w:pPr>
+        <w:spacing w:after="160"/>
+      </w:pPr>
+      <w:r>
+        <w:t xml:space="preserve">Gera automaticamente, a partir de "Manter Animais e Raças" (UC03), "Alimentar Setores e Sobra de Alimentação" (UC08) e "Vacinar Animais" (UC10), um lançamento de custo (custo_animal) vinculado ao animal, com o valor fotografado no momento do evento (preço do insumo ou valor de aquisição). O lançamento pertence ao animal, não ao lote: ao ser transferido entre lotes (UC04), o animal leva seu histórico de custo consigo, e o total do novo lote passa a somá-lo. Não gera lançamento financeiro no DRE (mesmo comportamento de "Alimentar Setores" e "Vacinar Animais").</w:t>
+      </w:r>
+    </w:p>
+    <w:p>
+      <w:pPr>
+        <w:spacing w:after="160"/>
+      </w:pPr>
+      <w:r>
+        <w:rPr>
+          <w:b/>
+          <w:bCs/>
+        </w:rPr>
+        <w:t xml:space="preserve">Campos — Lançamento de Custo (gerado automaticamente, não editável pelo usuário)</w:t>
+      </w:r>
+    </w:p>
+    <w:tbl>
+      <w:tblPr>
+        <w:tblW w:type="dxa" w:w="9026"/>
+        <w:tblBorders>
+          <w:top w:val="single" w:color="B9C4B4" w:sz="2"/>
+          <w:left w:val="single" w:color="B9C4B4" w:sz="2"/>
+          <w:bottom w:val="single" w:color="B9C4B4" w:sz="2"/>
+          <w:right w:val="single" w:color="B9C4B4" w:sz="2"/>
+          <w:insideH w:val="single" w:color="B9C4B4" w:sz="2"/>
+          <w:insideV w:val="single" w:color="B9C4B4" w:sz="2"/>
+        </w:tblBorders>
+      </w:tblPr>
+      <w:tblGrid>
+        <w:gridCol w:w="100"/>
+        <w:gridCol w:w="100"/>
+        <w:gridCol w:w="100"/>
+        <w:gridCol w:w="100"/>
+        <w:gridCol w:w="100"/>
+        <w:gridCol w:w="100"/>
+        <w:gridCol w:w="100"/>
+      </w:tblGrid>
+      <w:tr>
+        <w:trPr>
+          <w:tblHeader/>
+        </w:trPr>
+        <w:tc>
+          <w:tcPr>
+            <w:tcW w:type="dxa" w:w="1289"/>
+            <w:shd w:fill="2F5233" w:color="auto" w:val="clear"/>
+          </w:tcPr>
+          <w:p>
+            <w:r>
+              <w:rPr>
+                <w:b/>
+                <w:bCs/>
+                <w:color w:val="FFFFFF"/>
+                <w:sz w:val="18"/>
+                <w:szCs w:val="18"/>
+              </w:rPr>
+              <w:t xml:space="preserve">Nº</w:t>
+            </w:r>
+          </w:p>
+        </w:tc>
+        <w:tc>
+          <w:tcPr>
+            <w:tcW w:type="dxa" w:w="1289"/>
+            <w:shd w:fill="2F5233" w:color="auto" w:val="clear"/>
+          </w:tcPr>
+          <w:p>
+            <w:r>
+              <w:rPr>
+                <w:b/>
+                <w:bCs/>
+                <w:color w:val="FFFFFF"/>
+                <w:sz w:val="18"/>
+                <w:szCs w:val="18"/>
+              </w:rPr>
+              <w:t xml:space="preserve">Nome</w:t>
+            </w:r>
+          </w:p>
+        </w:tc>
+        <w:tc>
+          <w:tcPr>
+            <w:tcW w:type="dxa" w:w="1289"/>
+            <w:shd w:fill="2F5233" w:color="auto" w:val="clear"/>
+          </w:tcPr>
+          <w:p>
+            <w:r>
+              <w:rPr>
+                <w:b/>
+                <w:bCs/>
+                <w:color w:val="FFFFFF"/>
+                <w:sz w:val="18"/>
+                <w:szCs w:val="18"/>
+              </w:rPr>
+              <w:t xml:space="preserve">Descrição</w:t>
+            </w:r>
+          </w:p>
+        </w:tc>
+        <w:tc>
+          <w:tcPr>
+            <w:tcW w:type="dxa" w:w="1289"/>
+            <w:shd w:fill="2F5233" w:color="auto" w:val="clear"/>
+          </w:tcPr>
+          <w:p>
+            <w:r>
+              <w:rPr>
+                <w:b/>
+                <w:bCs/>
+                <w:color w:val="FFFFFF"/>
+                <w:sz w:val="18"/>
+                <w:szCs w:val="18"/>
+              </w:rPr>
+              <w:t xml:space="preserve">Grupo</w:t>
+            </w:r>
+          </w:p>
+        </w:tc>
+        <w:tc>
+          <w:tcPr>
+            <w:tcW w:type="dxa" w:w="1289"/>
+            <w:shd w:fill="2F5233" w:color="auto" w:val="clear"/>
+          </w:tcPr>
+          <w:p>
+            <w:r>
+              <w:rPr>
+                <w:b/>
+                <w:bCs/>
+                <w:color w:val="FFFFFF"/>
+                <w:sz w:val="18"/>
+                <w:szCs w:val="18"/>
+              </w:rPr>
+              <w:t xml:space="preserve">Requisitos de Conteúdo</w:t>
+            </w:r>
+          </w:p>
+        </w:tc>
+        <w:tc>
+          <w:tcPr>
+            <w:tcW w:type="dxa" w:w="1289"/>
+            <w:shd w:fill="2F5233" w:color="auto" w:val="clear"/>
+          </w:tcPr>
+          <w:p>
+            <w:r>
+              <w:rPr>
+                <w:b/>
+                <w:bCs/>
+                <w:color w:val="FFFFFF"/>
+                <w:sz w:val="18"/>
+                <w:szCs w:val="18"/>
+              </w:rPr>
+              <w:t xml:space="preserve">Requisitos de Edição</w:t>
+            </w:r>
+          </w:p>
+        </w:tc>
+        <w:tc>
+          <w:tcPr>
+            <w:tcW w:type="dxa" w:w="1289"/>
+            <w:shd w:fill="2F5233" w:color="auto" w:val="clear"/>
+          </w:tcPr>
+          <w:p>
+            <w:r>
+              <w:rPr>
+                <w:b/>
+                <w:bCs/>
+                <w:color w:val="FFFFFF"/>
+                <w:sz w:val="18"/>
+                <w:szCs w:val="18"/>
+              </w:rPr>
+              <w:t xml:space="preserve">Requisitos Diversos</w:t>
+            </w:r>
+          </w:p>
+        </w:tc>
+      </w:tr>
+      <w:tr>
+        <w:tc>
+          <w:tcPr>
+            <w:tcW w:type="dxa" w:w="1289"/>
+            <w:shd w:fill="F2F5F0" w:color="auto" w:val="clear"/>
+          </w:tcPr>
+          <w:p>
+            <w:r>
+              <w:rPr>
+                <w:sz w:val="18"/>
+                <w:szCs w:val="18"/>
+              </w:rPr>
+              <w:t xml:space="preserve">1</w:t>
+            </w:r>
+          </w:p>
+        </w:tc>
+        <w:tc>
+          <w:tcPr>
+            <w:tcW w:type="dxa" w:w="1289"/>
+            <w:shd w:fill="F2F5F0" w:color="auto" w:val="clear"/>
+          </w:tcPr>
+          <w:p>
+            <w:r>
+              <w:rPr>
+                <w:sz w:val="18"/>
+                <w:szCs w:val="18"/>
+              </w:rPr>
+              <w:t xml:space="preserve">Tipo de Custo</w:t>
+            </w:r>
+          </w:p>
+        </w:tc>
+        <w:tc>
+          <w:tcPr>
+            <w:tcW w:type="dxa" w:w="1289"/>
+            <w:shd w:fill="F2F5F0" w:color="auto" w:val="clear"/>
+          </w:tcPr>
+          <w:p>
+            <w:r>
+              <w:rPr>
+                <w:sz w:val="18"/>
+                <w:szCs w:val="18"/>
+              </w:rPr>
+              <w:t xml:space="preserve">Categoria do lançamento</w:t>
+            </w:r>
+          </w:p>
+        </w:tc>
+        <w:tc>
+          <w:tcPr>
+            <w:tcW w:type="dxa" w:w="1289"/>
+            <w:shd w:fill="F2F5F0" w:color="auto" w:val="clear"/>
+          </w:tcPr>
+          <w:p>
+            <w:r>
+              <w:rPr>
+                <w:sz w:val="18"/>
+                <w:szCs w:val="18"/>
+              </w:rPr>
+              <w:t xml:space="preserve">Dados do lançamento</w:t>
+            </w:r>
+          </w:p>
+        </w:tc>
+        <w:tc>
+          <w:tcPr>
+            <w:tcW w:type="dxa" w:w="1289"/>
+            <w:shd w:fill="F2F5F0" w:color="auto" w:val="clear"/>
+          </w:tcPr>
+          <w:p>
+            <w:r>
+              <w:rPr>
+                <w:sz w:val="18"/>
+                <w:szCs w:val="18"/>
+              </w:rPr>
+              <w:t xml:space="preserve">Aquisição, Alimentação ou Vacinação</w:t>
+            </w:r>
+          </w:p>
+        </w:tc>
+        <w:tc>
+          <w:tcPr>
+            <w:tcW w:type="dxa" w:w="1289"/>
+            <w:shd w:fill="F2F5F0" w:color="auto" w:val="clear"/>
+          </w:tcPr>
+          <w:p>
+            <w:r>
+              <w:rPr>
+                <w:sz w:val="18"/>
+                <w:szCs w:val="18"/>
+              </w:rPr>
+              <w:t xml:space="preserve">Somente leitura</w:t>
+            </w:r>
+          </w:p>
+        </w:tc>
+        <w:tc>
+          <w:tcPr>
+            <w:tcW w:type="dxa" w:w="1289"/>
+            <w:shd w:fill="F2F5F0" w:color="auto" w:val="clear"/>
+          </w:tcPr>
+          <w:p>
+            <w:r>
+              <w:rPr>
+                <w:sz w:val="18"/>
+                <w:szCs w:val="18"/>
+              </w:rPr>
+              <w:t xml:space="preserve">Gerado automaticamente a partir do evento de origem</w:t>
+            </w:r>
+          </w:p>
+        </w:tc>
+      </w:tr>
+      <w:tr>
+        <w:tc>
+          <w:tcPr>
+            <w:tcW w:type="dxa" w:w="1289"/>
+            <w:shd w:fill="FFFFFF" w:color="auto" w:val="clear"/>
+          </w:tcPr>
+          <w:p>
+            <w:r>
+              <w:rPr>
+                <w:sz w:val="18"/>
+                <w:szCs w:val="18"/>
+              </w:rPr>
+              <w:t xml:space="preserve">2</w:t>
+            </w:r>
+          </w:p>
+        </w:tc>
+        <w:tc>
+          <w:tcPr>
+            <w:tcW w:type="dxa" w:w="1289"/>
+            <w:shd w:fill="FFFFFF" w:color="auto" w:val="clear"/>
+          </w:tcPr>
+          <w:p>
+            <w:r>
+              <w:rPr>
+                <w:sz w:val="18"/>
+                <w:szCs w:val="18"/>
+              </w:rPr>
+              <w:t xml:space="preserve">Valor</w:t>
+            </w:r>
+          </w:p>
+        </w:tc>
+        <w:tc>
+          <w:tcPr>
+            <w:tcW w:type="dxa" w:w="1289"/>
+            <w:shd w:fill="FFFFFF" w:color="auto" w:val="clear"/>
+          </w:tcPr>
+          <w:p>
+            <w:r>
+              <w:rPr>
+                <w:sz w:val="18"/>
+                <w:szCs w:val="18"/>
+              </w:rPr>
+              <w:t xml:space="preserve">Valor fotografado no momento do evento (preço do insumo ou valor de aquisição)</w:t>
+            </w:r>
+          </w:p>
+        </w:tc>
+        <w:tc>
+          <w:tcPr>
+            <w:tcW w:type="dxa" w:w="1289"/>
+            <w:shd w:fill="FFFFFF" w:color="auto" w:val="clear"/>
+          </w:tcPr>
+          <w:p>
+            <w:r>
+              <w:rPr>
+                <w:sz w:val="18"/>
+                <w:szCs w:val="18"/>
+              </w:rPr>
+              <w:t xml:space="preserve">Dados do lançamento</w:t>
+            </w:r>
+          </w:p>
+        </w:tc>
+        <w:tc>
+          <w:tcPr>
+            <w:tcW w:type="dxa" w:w="1289"/>
+            <w:shd w:fill="FFFFFF" w:color="auto" w:val="clear"/>
+          </w:tcPr>
+          <w:p>
+            <w:r>
+              <w:rPr>
+                <w:sz w:val="18"/>
+                <w:szCs w:val="18"/>
+              </w:rPr>
+              <w:t xml:space="preserve">Número decimal</w:t>
+            </w:r>
+          </w:p>
+        </w:tc>
+        <w:tc>
+          <w:tcPr>
+            <w:tcW w:type="dxa" w:w="1289"/>
+            <w:shd w:fill="FFFFFF" w:color="auto" w:val="clear"/>
+          </w:tcPr>
+          <w:p>
+            <w:r>
+              <w:rPr>
+                <w:sz w:val="18"/>
+                <w:szCs w:val="18"/>
+              </w:rPr>
+              <w:t xml:space="preserve">Somente leitura</w:t>
+            </w:r>
+          </w:p>
+        </w:tc>
+        <w:tc>
+          <w:tcPr>
+            <w:tcW w:type="dxa" w:w="1289"/>
+            <w:shd w:fill="FFFFFF" w:color="auto" w:val="clear"/>
+          </w:tcPr>
+          <w:p>
+            <w:r>
+              <w:rPr>
+                <w:sz w:val="18"/>
+                <w:szCs w:val="18"/>
+              </w:rPr>
+              <w:t xml:space="preserve">Não é recalculado se o preço do insumo mudar depois</w:t>
+            </w:r>
+          </w:p>
+        </w:tc>
+      </w:tr>
+      <w:tr>
+        <w:tc>
+          <w:tcPr>
+            <w:tcW w:type="dxa" w:w="1289"/>
+            <w:shd w:fill="F2F5F0" w:color="auto" w:val="clear"/>
+          </w:tcPr>
+          <w:p>
+            <w:r>
+              <w:rPr>
+                <w:sz w:val="18"/>
+                <w:szCs w:val="18"/>
+              </w:rPr>
+              <w:t xml:space="preserve">3</w:t>
+            </w:r>
+          </w:p>
+        </w:tc>
+        <w:tc>
+          <w:tcPr>
+            <w:tcW w:type="dxa" w:w="1289"/>
+            <w:shd w:fill="F2F5F0" w:color="auto" w:val="clear"/>
+          </w:tcPr>
+          <w:p>
+            <w:r>
+              <w:rPr>
+                <w:sz w:val="18"/>
+                <w:szCs w:val="18"/>
+              </w:rPr>
+              <w:t xml:space="preserve">Quantidade</w:t>
+            </w:r>
+          </w:p>
+        </w:tc>
+        <w:tc>
+          <w:tcPr>
+            <w:tcW w:type="dxa" w:w="1289"/>
+            <w:shd w:fill="F2F5F0" w:color="auto" w:val="clear"/>
+          </w:tcPr>
+          <w:p>
+            <w:r>
+              <w:rPr>
+                <w:sz w:val="18"/>
+                <w:szCs w:val="18"/>
+              </w:rPr>
+              <w:t xml:space="preserve">Quantidade consumida ou aplicada que originou o valor (ração, dose)</w:t>
+            </w:r>
+          </w:p>
+        </w:tc>
+        <w:tc>
+          <w:tcPr>
+            <w:tcW w:type="dxa" w:w="1289"/>
+            <w:shd w:fill="F2F5F0" w:color="auto" w:val="clear"/>
+          </w:tcPr>
+          <w:p>
+            <w:r>
+              <w:rPr>
+                <w:sz w:val="18"/>
+                <w:szCs w:val="18"/>
+              </w:rPr>
+              <w:t xml:space="preserve">Dados do lançamento</w:t>
+            </w:r>
+          </w:p>
+        </w:tc>
+        <w:tc>
+          <w:tcPr>
+            <w:tcW w:type="dxa" w:w="1289"/>
+            <w:shd w:fill="F2F5F0" w:color="auto" w:val="clear"/>
+          </w:tcPr>
+          <w:p>
+            <w:r>
+              <w:rPr>
+                <w:sz w:val="18"/>
+                <w:szCs w:val="18"/>
+              </w:rPr>
+              <w:t xml:space="preserve">Número decimal</w:t>
+            </w:r>
+          </w:p>
+        </w:tc>
+        <w:tc>
+          <w:tcPr>
+            <w:tcW w:type="dxa" w:w="1289"/>
+            <w:shd w:fill="F2F5F0" w:color="auto" w:val="clear"/>
+          </w:tcPr>
+          <w:p>
+            <w:r>
+              <w:rPr>
+                <w:sz w:val="18"/>
+                <w:szCs w:val="18"/>
+              </w:rPr>
+              <w:t xml:space="preserve">Somente leitura</w:t>
+            </w:r>
+          </w:p>
+        </w:tc>
+        <w:tc>
+          <w:tcPr>
+            <w:tcW w:type="dxa" w:w="1289"/>
+            <w:shd w:fill="F2F5F0" w:color="auto" w:val="clear"/>
+          </w:tcPr>
+          <w:p>
+            <w:r>
+              <w:rPr>
+                <w:sz w:val="18"/>
+                <w:szCs w:val="18"/>
+              </w:rPr>
+              <w:t xml:space="preserve">Nulo para lançamentos de aquisição</w:t>
+            </w:r>
+          </w:p>
+        </w:tc>
+      </w:tr>
+      <w:tr>
+        <w:tc>
+          <w:tcPr>
+            <w:tcW w:type="dxa" w:w="1289"/>
+            <w:shd w:fill="FFFFFF" w:color="auto" w:val="clear"/>
+          </w:tcPr>
+          <w:p>
+            <w:r>
+              <w:rPr>
+                <w:sz w:val="18"/>
+                <w:szCs w:val="18"/>
+              </w:rPr>
+              <w:t xml:space="preserve">4</w:t>
+            </w:r>
+          </w:p>
+        </w:tc>
+        <w:tc>
+          <w:tcPr>
+            <w:tcW w:type="dxa" w:w="1289"/>
+            <w:shd w:fill="FFFFFF" w:color="auto" w:val="clear"/>
+          </w:tcPr>
+          <w:p>
+            <w:r>
+              <w:rPr>
+                <w:sz w:val="18"/>
+                <w:szCs w:val="18"/>
+              </w:rPr>
+              <w:t xml:space="preserve">Data do Evento</w:t>
+            </w:r>
+          </w:p>
+        </w:tc>
+        <w:tc>
+          <w:tcPr>
+            <w:tcW w:type="dxa" w:w="1289"/>
+            <w:shd w:fill="FFFFFF" w:color="auto" w:val="clear"/>
+          </w:tcPr>
+          <w:p>
+            <w:r>
+              <w:rPr>
+                <w:sz w:val="18"/>
+                <w:szCs w:val="18"/>
+              </w:rPr>
+              <w:t xml:space="preserve">Data/hora em que o custo ocorreu</w:t>
+            </w:r>
+          </w:p>
+        </w:tc>
+        <w:tc>
+          <w:tcPr>
+            <w:tcW w:type="dxa" w:w="1289"/>
+            <w:shd w:fill="FFFFFF" w:color="auto" w:val="clear"/>
+          </w:tcPr>
+          <w:p>
+            <w:r>
+              <w:rPr>
+                <w:sz w:val="18"/>
+                <w:szCs w:val="18"/>
+              </w:rPr>
+              <w:t xml:space="preserve">Dados do lançamento</w:t>
+            </w:r>
+          </w:p>
+        </w:tc>
+        <w:tc>
+          <w:tcPr>
+            <w:tcW w:type="dxa" w:w="1289"/>
+            <w:shd w:fill="FFFFFF" w:color="auto" w:val="clear"/>
+          </w:tcPr>
+          <w:p>
+            <w:r>
+              <w:rPr>
+                <w:sz w:val="18"/>
+                <w:szCs w:val="18"/>
+              </w:rPr>
+              <w:t xml:space="preserve">Data/hora</w:t>
+            </w:r>
+          </w:p>
+        </w:tc>
+        <w:tc>
+          <w:tcPr>
+            <w:tcW w:type="dxa" w:w="1289"/>
+            <w:shd w:fill="FFFFFF" w:color="auto" w:val="clear"/>
+          </w:tcPr>
+          <w:p>
+            <w:r>
+              <w:rPr>
+                <w:sz w:val="18"/>
+                <w:szCs w:val="18"/>
+              </w:rPr>
+              <w:t xml:space="preserve">Somente leitura</w:t>
+            </w:r>
+          </w:p>
+        </w:tc>
+        <w:tc>
+          <w:tcPr>
+            <w:tcW w:type="dxa" w:w="1289"/>
+            <w:shd w:fill="FFFFFF" w:color="auto" w:val="clear"/>
+          </w:tcPr>
+          <w:p>
+            <w:r>
+              <w:rPr>
+                <w:sz w:val="18"/>
+                <w:szCs w:val="18"/>
+              </w:rPr>
+              <w:t xml:space="preserve">—</w:t>
+            </w:r>
+          </w:p>
+        </w:tc>
+      </w:tr>
+      <w:tr>
+        <w:tc>
+          <w:tcPr>
+            <w:tcW w:type="dxa" w:w="1289"/>
+            <w:shd w:fill="F2F5F0" w:color="auto" w:val="clear"/>
+          </w:tcPr>
+          <w:p>
+            <w:r>
+              <w:rPr>
+                <w:sz w:val="18"/>
+                <w:szCs w:val="18"/>
+              </w:rPr>
+              <w:t xml:space="preserve">5</w:t>
+            </w:r>
+          </w:p>
+        </w:tc>
+        <w:tc>
+          <w:tcPr>
+            <w:tcW w:type="dxa" w:w="1289"/>
+            <w:shd w:fill="F2F5F0" w:color="auto" w:val="clear"/>
+          </w:tcPr>
+          <w:p>
+            <w:r>
+              <w:rPr>
+                <w:sz w:val="18"/>
+                <w:szCs w:val="18"/>
+              </w:rPr>
+              <w:t xml:space="preserve">Descrição</w:t>
+            </w:r>
+          </w:p>
+        </w:tc>
+        <w:tc>
+          <w:tcPr>
+            <w:tcW w:type="dxa" w:w="1289"/>
+            <w:shd w:fill="F2F5F0" w:color="auto" w:val="clear"/>
+          </w:tcPr>
+          <w:p>
+            <w:r>
+              <w:rPr>
+                <w:sz w:val="18"/>
+                <w:szCs w:val="18"/>
+              </w:rPr>
+              <w:t xml:space="preserve">Texto descritivo do evento (ex.: nome do insumo e setor, ou da vacina)</w:t>
+            </w:r>
+          </w:p>
+        </w:tc>
+        <w:tc>
+          <w:tcPr>
+            <w:tcW w:type="dxa" w:w="1289"/>
+            <w:shd w:fill="F2F5F0" w:color="auto" w:val="clear"/>
+          </w:tcPr>
+          <w:p>
+            <w:r>
+              <w:rPr>
+                <w:sz w:val="18"/>
+                <w:szCs w:val="18"/>
+              </w:rPr>
+              <w:t xml:space="preserve">Dados do lançamento</w:t>
+            </w:r>
+          </w:p>
+        </w:tc>
+        <w:tc>
+          <w:tcPr>
+            <w:tcW w:type="dxa" w:w="1289"/>
+            <w:shd w:fill="F2F5F0" w:color="auto" w:val="clear"/>
+          </w:tcPr>
+          <w:p>
+            <w:r>
+              <w:rPr>
+                <w:sz w:val="18"/>
+                <w:szCs w:val="18"/>
+              </w:rPr>
+              <w:t xml:space="preserve">Texto</w:t>
+            </w:r>
+          </w:p>
+        </w:tc>
+        <w:tc>
+          <w:tcPr>
+            <w:tcW w:type="dxa" w:w="1289"/>
+            <w:shd w:fill="F2F5F0" w:color="auto" w:val="clear"/>
+          </w:tcPr>
+          <w:p>
+            <w:r>
+              <w:rPr>
+                <w:sz w:val="18"/>
+                <w:szCs w:val="18"/>
+              </w:rPr>
+              <w:t xml:space="preserve">Somente leitura</w:t>
+            </w:r>
+          </w:p>
+        </w:tc>
+        <w:tc>
+          <w:tcPr>
+            <w:tcW w:type="dxa" w:w="1289"/>
+            <w:shd w:fill="F2F5F0" w:color="auto" w:val="clear"/>
+          </w:tcPr>
+          <w:p>
+            <w:r>
+              <w:rPr>
+                <w:sz w:val="18"/>
+                <w:szCs w:val="18"/>
+              </w:rPr>
+              <w:t xml:space="preserve">—</w:t>
+            </w:r>
+          </w:p>
+        </w:tc>
+      </w:tr>
+    </w:tbl>
+    <w:p>
+      <w:pPr>
+        <w:spacing w:after="160"/>
+      </w:pPr>
+    </w:p>
+    <w:p>
+      <w:pPr>
+        <w:spacing w:after="160"/>
+      </w:pPr>
+      <w:r>
+        <w:rPr>
+          <w:b/>
+          <w:bCs/>
+        </w:rPr>
+        <w:t xml:space="preserve">Campos — Aquisição do Animal (informados no cadastro do animal, UC03)</w:t>
+      </w:r>
+    </w:p>
+    <w:tbl>
+      <w:tblPr>
+        <w:tblW w:type="dxa" w:w="9026"/>
+        <w:tblBorders>
+          <w:top w:val="single" w:color="B9C4B4" w:sz="2"/>
+          <w:left w:val="single" w:color="B9C4B4" w:sz="2"/>
+          <w:bottom w:val="single" w:color="B9C4B4" w:sz="2"/>
+          <w:right w:val="single" w:color="B9C4B4" w:sz="2"/>
+          <w:insideH w:val="single" w:color="B9C4B4" w:sz="2"/>
+          <w:insideV w:val="single" w:color="B9C4B4" w:sz="2"/>
+        </w:tblBorders>
+      </w:tblPr>
+      <w:tblGrid>
+        <w:gridCol w:w="100"/>
+        <w:gridCol w:w="100"/>
+        <w:gridCol w:w="100"/>
+        <w:gridCol w:w="100"/>
+        <w:gridCol w:w="100"/>
+        <w:gridCol w:w="100"/>
+        <w:gridCol w:w="100"/>
+      </w:tblGrid>
+      <w:tr>
+        <w:trPr>
+          <w:tblHeader/>
+        </w:trPr>
+        <w:tc>
+          <w:tcPr>
+            <w:tcW w:type="dxa" w:w="1289"/>
+            <w:shd w:fill="2F5233" w:color="auto" w:val="clear"/>
+          </w:tcPr>
+          <w:p>
+            <w:r>
+              <w:rPr>
+                <w:b/>
+                <w:bCs/>
+                <w:color w:val="FFFFFF"/>
+                <w:sz w:val="18"/>
+                <w:szCs w:val="18"/>
+              </w:rPr>
+              <w:t xml:space="preserve">Nº</w:t>
+            </w:r>
+          </w:p>
+        </w:tc>
+        <w:tc>
+          <w:tcPr>
+            <w:tcW w:type="dxa" w:w="1289"/>
+            <w:shd w:fill="2F5233" w:color="auto" w:val="clear"/>
+          </w:tcPr>
+          <w:p>
+            <w:r>
+              <w:rPr>
+                <w:b/>
+                <w:bCs/>
+                <w:color w:val="FFFFFF"/>
+                <w:sz w:val="18"/>
+                <w:szCs w:val="18"/>
+              </w:rPr>
+              <w:t xml:space="preserve">Nome</w:t>
+            </w:r>
+          </w:p>
+        </w:tc>
+        <w:tc>
+          <w:tcPr>
+            <w:tcW w:type="dxa" w:w="1289"/>
+            <w:shd w:fill="2F5233" w:color="auto" w:val="clear"/>
+          </w:tcPr>
+          <w:p>
+            <w:r>
+              <w:rPr>
+                <w:b/>
+                <w:bCs/>
+                <w:color w:val="FFFFFF"/>
+                <w:sz w:val="18"/>
+                <w:szCs w:val="18"/>
+              </w:rPr>
+              <w:t xml:space="preserve">Descrição</w:t>
+            </w:r>
+          </w:p>
+        </w:tc>
+        <w:tc>
+          <w:tcPr>
+            <w:tcW w:type="dxa" w:w="1289"/>
+            <w:shd w:fill="2F5233" w:color="auto" w:val="clear"/>
+          </w:tcPr>
+          <w:p>
+            <w:r>
+              <w:rPr>
+                <w:b/>
+                <w:bCs/>
+                <w:color w:val="FFFFFF"/>
+                <w:sz w:val="18"/>
+                <w:szCs w:val="18"/>
+              </w:rPr>
+              <w:t xml:space="preserve">Grupo</w:t>
+            </w:r>
+          </w:p>
+        </w:tc>
+        <w:tc>
+          <w:tcPr>
+            <w:tcW w:type="dxa" w:w="1289"/>
+            <w:shd w:fill="2F5233" w:color="auto" w:val="clear"/>
+          </w:tcPr>
+          <w:p>
+            <w:r>
+              <w:rPr>
+                <w:b/>
+                <w:bCs/>
+                <w:color w:val="FFFFFF"/>
+                <w:sz w:val="18"/>
+                <w:szCs w:val="18"/>
+              </w:rPr>
+              <w:t xml:space="preserve">Requisitos de Conteúdo</w:t>
+            </w:r>
+          </w:p>
+        </w:tc>
+        <w:tc>
+          <w:tcPr>
+            <w:tcW w:type="dxa" w:w="1289"/>
+            <w:shd w:fill="2F5233" w:color="auto" w:val="clear"/>
+          </w:tcPr>
+          <w:p>
+            <w:r>
+              <w:rPr>
+                <w:b/>
+                <w:bCs/>
+                <w:color w:val="FFFFFF"/>
+                <w:sz w:val="18"/>
+                <w:szCs w:val="18"/>
+              </w:rPr>
+              <w:t xml:space="preserve">Requisitos de Edição</w:t>
+            </w:r>
+          </w:p>
+        </w:tc>
+        <w:tc>
+          <w:tcPr>
+            <w:tcW w:type="dxa" w:w="1289"/>
+            <w:shd w:fill="2F5233" w:color="auto" w:val="clear"/>
+          </w:tcPr>
+          <w:p>
+            <w:r>
+              <w:rPr>
+                <w:b/>
+                <w:bCs/>
+                <w:color w:val="FFFFFF"/>
+                <w:sz w:val="18"/>
+                <w:szCs w:val="18"/>
+              </w:rPr>
+              <w:t xml:space="preserve">Requisitos Diversos</w:t>
+            </w:r>
+          </w:p>
+        </w:tc>
+      </w:tr>
+      <w:tr>
+        <w:tc>
+          <w:tcPr>
+            <w:tcW w:type="dxa" w:w="1289"/>
+            <w:shd w:fill="F2F5F0" w:color="auto" w:val="clear"/>
+          </w:tcPr>
+          <w:p>
+            <w:r>
+              <w:rPr>
+                <w:sz w:val="18"/>
+                <w:szCs w:val="18"/>
+              </w:rPr>
+              <w:t xml:space="preserve">1</w:t>
+            </w:r>
+          </w:p>
+        </w:tc>
+        <w:tc>
+          <w:tcPr>
+            <w:tcW w:type="dxa" w:w="1289"/>
+            <w:shd w:fill="F2F5F0" w:color="auto" w:val="clear"/>
+          </w:tcPr>
+          <w:p>
+            <w:r>
+              <w:rPr>
+                <w:sz w:val="18"/>
+                <w:szCs w:val="18"/>
+              </w:rPr>
+              <w:t xml:space="preserve">Valor de Aquisição</w:t>
+            </w:r>
+          </w:p>
+        </w:tc>
+        <w:tc>
+          <w:tcPr>
+            <w:tcW w:type="dxa" w:w="1289"/>
+            <w:shd w:fill="F2F5F0" w:color="auto" w:val="clear"/>
+          </w:tcPr>
+          <w:p>
+            <w:r>
+              <w:rPr>
+                <w:sz w:val="18"/>
+                <w:szCs w:val="18"/>
+              </w:rPr>
+              <w:t xml:space="preserve">Preço pago na compra do animal</w:t>
+            </w:r>
+          </w:p>
+        </w:tc>
+        <w:tc>
+          <w:tcPr>
+            <w:tcW w:type="dxa" w:w="1289"/>
+            <w:shd w:fill="F2F5F0" w:color="auto" w:val="clear"/>
+          </w:tcPr>
+          <w:p>
+            <w:r>
+              <w:rPr>
+                <w:sz w:val="18"/>
+                <w:szCs w:val="18"/>
+              </w:rPr>
+              <w:t xml:space="preserve">Dados do animal</w:t>
+            </w:r>
+          </w:p>
+        </w:tc>
+        <w:tc>
+          <w:tcPr>
+            <w:tcW w:type="dxa" w:w="1289"/>
+            <w:shd w:fill="F2F5F0" w:color="auto" w:val="clear"/>
+          </w:tcPr>
+          <w:p>
+            <w:r>
+              <w:rPr>
+                <w:sz w:val="18"/>
+                <w:szCs w:val="18"/>
+              </w:rPr>
+              <w:t xml:space="preserve">Número decimal</w:t>
+            </w:r>
+          </w:p>
+        </w:tc>
+        <w:tc>
+          <w:tcPr>
+            <w:tcW w:type="dxa" w:w="1289"/>
+            <w:shd w:fill="F2F5F0" w:color="auto" w:val="clear"/>
+          </w:tcPr>
+          <w:p>
+            <w:r>
+              <w:rPr>
+                <w:sz w:val="18"/>
+                <w:szCs w:val="18"/>
+              </w:rPr>
+              <w:t xml:space="preserve">Opcional</w:t>
+            </w:r>
+          </w:p>
+        </w:tc>
+        <w:tc>
+          <w:tcPr>
+            <w:tcW w:type="dxa" w:w="1289"/>
+            <w:shd w:fill="F2F5F0" w:color="auto" w:val="clear"/>
+          </w:tcPr>
+          <w:p>
+            <w:r>
+              <w:rPr>
+                <w:sz w:val="18"/>
+                <w:szCs w:val="18"/>
+              </w:rPr>
+              <w:t xml:space="preserve">Gera o lançamento de custo do tipo Aquisição</w:t>
+            </w:r>
+          </w:p>
+        </w:tc>
+      </w:tr>
+      <w:tr>
+        <w:tc>
+          <w:tcPr>
+            <w:tcW w:type="dxa" w:w="1289"/>
+            <w:shd w:fill="FFFFFF" w:color="auto" w:val="clear"/>
+          </w:tcPr>
+          <w:p>
+            <w:r>
+              <w:rPr>
+                <w:sz w:val="18"/>
+                <w:szCs w:val="18"/>
+              </w:rPr>
+              <w:t xml:space="preserve">2</w:t>
+            </w:r>
+          </w:p>
+        </w:tc>
+        <w:tc>
+          <w:tcPr>
+            <w:tcW w:type="dxa" w:w="1289"/>
+            <w:shd w:fill="FFFFFF" w:color="auto" w:val="clear"/>
+          </w:tcPr>
+          <w:p>
+            <w:r>
+              <w:rPr>
+                <w:sz w:val="18"/>
+                <w:szCs w:val="18"/>
+              </w:rPr>
+              <w:t xml:space="preserve">Data de Aquisição</w:t>
+            </w:r>
+          </w:p>
+        </w:tc>
+        <w:tc>
+          <w:tcPr>
+            <w:tcW w:type="dxa" w:w="1289"/>
+            <w:shd w:fill="FFFFFF" w:color="auto" w:val="clear"/>
+          </w:tcPr>
+          <w:p>
+            <w:r>
+              <w:rPr>
+                <w:sz w:val="18"/>
+                <w:szCs w:val="18"/>
+              </w:rPr>
+              <w:t xml:space="preserve">Data da compra do animal</w:t>
+            </w:r>
+          </w:p>
+        </w:tc>
+        <w:tc>
+          <w:tcPr>
+            <w:tcW w:type="dxa" w:w="1289"/>
+            <w:shd w:fill="FFFFFF" w:color="auto" w:val="clear"/>
+          </w:tcPr>
+          <w:p>
+            <w:r>
+              <w:rPr>
+                <w:sz w:val="18"/>
+                <w:szCs w:val="18"/>
+              </w:rPr>
+              <w:t xml:space="preserve">Dados do animal</w:t>
+            </w:r>
+          </w:p>
+        </w:tc>
+        <w:tc>
+          <w:tcPr>
+            <w:tcW w:type="dxa" w:w="1289"/>
+            <w:shd w:fill="FFFFFF" w:color="auto" w:val="clear"/>
+          </w:tcPr>
+          <w:p>
+            <w:r>
+              <w:rPr>
+                <w:sz w:val="18"/>
+                <w:szCs w:val="18"/>
+              </w:rPr>
+              <w:t xml:space="preserve">Data</w:t>
+            </w:r>
+          </w:p>
+        </w:tc>
+        <w:tc>
+          <w:tcPr>
+            <w:tcW w:type="dxa" w:w="1289"/>
+            <w:shd w:fill="FFFFFF" w:color="auto" w:val="clear"/>
+          </w:tcPr>
+          <w:p>
+            <w:r>
+              <w:rPr>
+                <w:sz w:val="18"/>
+                <w:szCs w:val="18"/>
+              </w:rPr>
+              <w:t xml:space="preserve">Opcional</w:t>
+            </w:r>
+          </w:p>
+        </w:tc>
+        <w:tc>
+          <w:tcPr>
+            <w:tcW w:type="dxa" w:w="1289"/>
+            <w:shd w:fill="FFFFFF" w:color="auto" w:val="clear"/>
+          </w:tcPr>
+          <w:p>
+            <w:r>
+              <w:rPr>
+                <w:sz w:val="18"/>
+                <w:szCs w:val="18"/>
+              </w:rPr>
+              <w:t xml:space="preserve">Usada como data do evento de aquisição; se vazia, usa a data do cadastro</w:t>
+            </w:r>
+          </w:p>
+        </w:tc>
+      </w:tr>
+    </w:tbl>
+    <w:p>
+      <w:pPr>
+        <w:spacing w:after="160"/>
+      </w:pPr>
+    </w:p>
+    <w:p>
+      <w:pPr>
+        <w:spacing w:after="160"/>
+      </w:pPr>
+      <w:r>
+        <w:rPr>
+          <w:b/>
+          <w:bCs/>
+        </w:rPr>
+        <w:t xml:space="preserve">Comandos</w:t>
+      </w:r>
+    </w:p>
+    <w:tbl>
+      <w:tblPr>
+        <w:tblW w:type="dxa" w:w="9026"/>
+        <w:tblBorders>
+          <w:top w:val="single" w:color="B9C4B4" w:sz="2"/>
+          <w:left w:val="single" w:color="B9C4B4" w:sz="2"/>
+          <w:bottom w:val="single" w:color="B9C4B4" w:sz="2"/>
+          <w:right w:val="single" w:color="B9C4B4" w:sz="2"/>
+          <w:insideH w:val="single" w:color="B9C4B4" w:sz="2"/>
+          <w:insideV w:val="single" w:color="B9C4B4" w:sz="2"/>
+        </w:tblBorders>
+      </w:tblPr>
+      <w:tblGrid>
+        <w:gridCol w:w="100"/>
+        <w:gridCol w:w="100"/>
+        <w:gridCol w:w="100"/>
+        <w:gridCol w:w="100"/>
+        <w:gridCol w:w="100"/>
+        <w:gridCol w:w="100"/>
+      </w:tblGrid>
+      <w:tr>
+        <w:trPr>
+          <w:tblHeader/>
+        </w:trPr>
+        <w:tc>
+          <w:tcPr>
+            <w:tcW w:type="dxa" w:w="1504"/>
+            <w:shd w:fill="2F5233" w:color="auto" w:val="clear"/>
+          </w:tcPr>
+          <w:p>
+            <w:r>
+              <w:rPr>
+                <w:b/>
+                <w:bCs/>
+                <w:color w:val="FFFFFF"/>
+                <w:sz w:val="18"/>
+                <w:szCs w:val="18"/>
+              </w:rPr>
+              <w:t xml:space="preserve">Nº</w:t>
+            </w:r>
+          </w:p>
+        </w:tc>
+        <w:tc>
+          <w:tcPr>
+            <w:tcW w:type="dxa" w:w="1504"/>
+            <w:shd w:fill="2F5233" w:color="auto" w:val="clear"/>
+          </w:tcPr>
+          <w:p>
+            <w:r>
+              <w:rPr>
+                <w:b/>
+                <w:bCs/>
+                <w:color w:val="FFFFFF"/>
+                <w:sz w:val="18"/>
+                <w:szCs w:val="18"/>
+              </w:rPr>
+              <w:t xml:space="preserve">Nome</w:t>
+            </w:r>
+          </w:p>
+        </w:tc>
+        <w:tc>
+          <w:tcPr>
+            <w:tcW w:type="dxa" w:w="1504"/>
+            <w:shd w:fill="2F5233" w:color="auto" w:val="clear"/>
+          </w:tcPr>
+          <w:p>
+            <w:r>
+              <w:rPr>
+                <w:b/>
+                <w:bCs/>
+                <w:color w:val="FFFFFF"/>
+                <w:sz w:val="18"/>
+                <w:szCs w:val="18"/>
+              </w:rPr>
+              <w:t xml:space="preserve">Descrição</w:t>
+            </w:r>
+          </w:p>
+        </w:tc>
+        <w:tc>
+          <w:tcPr>
+            <w:tcW w:type="dxa" w:w="1504"/>
+            <w:shd w:fill="2F5233" w:color="auto" w:val="clear"/>
+          </w:tcPr>
+          <w:p>
+            <w:r>
+              <w:rPr>
+                <w:b/>
+                <w:bCs/>
+                <w:color w:val="FFFFFF"/>
+                <w:sz w:val="18"/>
+                <w:szCs w:val="18"/>
+              </w:rPr>
+              <w:t xml:space="preserve">Grupo</w:t>
+            </w:r>
+          </w:p>
+        </w:tc>
+        <w:tc>
+          <w:tcPr>
+            <w:tcW w:type="dxa" w:w="1504"/>
+            <w:shd w:fill="2F5233" w:color="auto" w:val="clear"/>
+          </w:tcPr>
+          <w:p>
+            <w:r>
+              <w:rPr>
+                <w:b/>
+                <w:bCs/>
+                <w:color w:val="FFFFFF"/>
+                <w:sz w:val="18"/>
+                <w:szCs w:val="18"/>
+              </w:rPr>
+              <w:t xml:space="preserve">Requisitos de Validade</w:t>
+            </w:r>
+          </w:p>
+        </w:tc>
+        <w:tc>
+          <w:tcPr>
+            <w:tcW w:type="dxa" w:w="1504"/>
+            <w:shd w:fill="2F5233" w:color="auto" w:val="clear"/>
+          </w:tcPr>
+          <w:p>
+            <w:r>
+              <w:rPr>
+                <w:b/>
+                <w:bCs/>
+                <w:color w:val="FFFFFF"/>
+                <w:sz w:val="18"/>
+                <w:szCs w:val="18"/>
+              </w:rPr>
+              <w:t xml:space="preserve">Requisitos Diversos</w:t>
+            </w:r>
+          </w:p>
+        </w:tc>
+      </w:tr>
+      <w:tr>
+        <w:tc>
+          <w:tcPr>
+            <w:tcW w:type="dxa" w:w="1504"/>
+            <w:shd w:fill="F2F5F0" w:color="auto" w:val="clear"/>
+          </w:tcPr>
+          <w:p>
+            <w:r>
+              <w:rPr>
+                <w:sz w:val="18"/>
+                <w:szCs w:val="18"/>
+              </w:rPr>
+              <w:t xml:space="preserve">1</w:t>
+            </w:r>
+          </w:p>
+        </w:tc>
+        <w:tc>
+          <w:tcPr>
+            <w:tcW w:type="dxa" w:w="1504"/>
+            <w:shd w:fill="F2F5F0" w:color="auto" w:val="clear"/>
+          </w:tcPr>
+          <w:p>
+            <w:r>
+              <w:rPr>
+                <w:sz w:val="18"/>
+                <w:szCs w:val="18"/>
+              </w:rPr>
+              <w:t xml:space="preserve">Consultar Custo de Vida do Animal</w:t>
+            </w:r>
+          </w:p>
+        </w:tc>
+        <w:tc>
+          <w:tcPr>
+            <w:tcW w:type="dxa" w:w="1504"/>
+            <w:shd w:fill="F2F5F0" w:color="auto" w:val="clear"/>
+          </w:tcPr>
+          <w:p>
+            <w:r>
+              <w:rPr>
+                <w:sz w:val="18"/>
+                <w:szCs w:val="18"/>
+              </w:rPr>
+              <w:t xml:space="preserve">Retorna os totais por categoria e o histórico de eventos de um animal</w:t>
+            </w:r>
+          </w:p>
+        </w:tc>
+        <w:tc>
+          <w:tcPr>
+            <w:tcW w:type="dxa" w:w="1504"/>
+            <w:shd w:fill="F2F5F0" w:color="auto" w:val="clear"/>
+          </w:tcPr>
+          <w:p>
+            <w:r>
+              <w:rPr>
+                <w:sz w:val="18"/>
+                <w:szCs w:val="18"/>
+              </w:rPr>
+              <w:t xml:space="preserve">Consulta</w:t>
+            </w:r>
+          </w:p>
+        </w:tc>
+        <w:tc>
+          <w:tcPr>
+            <w:tcW w:type="dxa" w:w="1504"/>
+            <w:shd w:fill="F2F5F0" w:color="auto" w:val="clear"/>
+          </w:tcPr>
+          <w:p>
+            <w:r>
+              <w:rPr>
+                <w:sz w:val="18"/>
+                <w:szCs w:val="18"/>
+              </w:rPr>
+              <w:t xml:space="preserve">Animal existente e ativo</w:t>
+            </w:r>
+          </w:p>
+        </w:tc>
+        <w:tc>
+          <w:tcPr>
+            <w:tcW w:type="dxa" w:w="1504"/>
+            <w:shd w:fill="F2F5F0" w:color="auto" w:val="clear"/>
+          </w:tcPr>
+          <w:p>
+            <w:r>
+              <w:rPr>
+                <w:sz w:val="18"/>
+                <w:szCs w:val="18"/>
+              </w:rPr>
+              <w:t xml:space="preserve">GET /animais/{id}/custo-vida</w:t>
+            </w:r>
+          </w:p>
+        </w:tc>
+      </w:tr>
+      <w:tr>
+        <w:tc>
+          <w:tcPr>
+            <w:tcW w:type="dxa" w:w="1504"/>
+            <w:shd w:fill="FFFFFF" w:color="auto" w:val="clear"/>
+          </w:tcPr>
+          <w:p>
+            <w:r>
+              <w:rPr>
+                <w:sz w:val="18"/>
+                <w:szCs w:val="18"/>
+              </w:rPr>
+              <w:t xml:space="preserve">2</w:t>
+            </w:r>
+          </w:p>
+        </w:tc>
+        <w:tc>
+          <w:tcPr>
+            <w:tcW w:type="dxa" w:w="1504"/>
+            <w:shd w:fill="FFFFFF" w:color="auto" w:val="clear"/>
+          </w:tcPr>
+          <w:p>
+            <w:r>
+              <w:rPr>
+                <w:sz w:val="18"/>
+                <w:szCs w:val="18"/>
+              </w:rPr>
+              <w:t xml:space="preserve">Consultar Custo Total do Lote</w:t>
+            </w:r>
+          </w:p>
+        </w:tc>
+        <w:tc>
+          <w:tcPr>
+            <w:tcW w:type="dxa" w:w="1504"/>
+            <w:shd w:fill="FFFFFF" w:color="auto" w:val="clear"/>
+          </w:tcPr>
+          <w:p>
+            <w:r>
+              <w:rPr>
+                <w:sz w:val="18"/>
+                <w:szCs w:val="18"/>
+              </w:rPr>
+              <w:t xml:space="preserve">Retorna os totais por categoria somando o ledger dos animais atualmente alocados ao lote</w:t>
+            </w:r>
+          </w:p>
+        </w:tc>
+        <w:tc>
+          <w:tcPr>
+            <w:tcW w:type="dxa" w:w="1504"/>
+            <w:shd w:fill="FFFFFF" w:color="auto" w:val="clear"/>
+          </w:tcPr>
+          <w:p>
+            <w:r>
+              <w:rPr>
+                <w:sz w:val="18"/>
+                <w:szCs w:val="18"/>
+              </w:rPr>
+              <w:t xml:space="preserve">Consulta</w:t>
+            </w:r>
+          </w:p>
+        </w:tc>
+        <w:tc>
+          <w:tcPr>
+            <w:tcW w:type="dxa" w:w="1504"/>
+            <w:shd w:fill="FFFFFF" w:color="auto" w:val="clear"/>
+          </w:tcPr>
+          <w:p>
+            <w:r>
+              <w:rPr>
+                <w:sz w:val="18"/>
+                <w:szCs w:val="18"/>
+              </w:rPr>
+              <w:t xml:space="preserve">Lote existente e ativo</w:t>
+            </w:r>
+          </w:p>
+        </w:tc>
+        <w:tc>
+          <w:tcPr>
+            <w:tcW w:type="dxa" w:w="1504"/>
+            <w:shd w:fill="FFFFFF" w:color="auto" w:val="clear"/>
+          </w:tcPr>
+          <w:p>
+            <w:r>
+              <w:rPr>
+                <w:sz w:val="18"/>
+                <w:szCs w:val="18"/>
+              </w:rPr>
+              <w:t xml:space="preserve">GET /lotes/{id}/custo-total — soma o ledger de cada animal atualmente no lote</w:t>
+            </w:r>
+          </w:p>
+        </w:tc>
+      </w:tr>
+      <w:tr>
+        <w:tc>
+          <w:tcPr>
+            <w:tcW w:type="dxa" w:w="1504"/>
+            <w:shd w:fill="F2F5F0" w:color="auto" w:val="clear"/>
+          </w:tcPr>
+          <w:p>
+            <w:r>
+              <w:rPr>
+                <w:sz w:val="18"/>
+                <w:szCs w:val="18"/>
+              </w:rPr>
+              <w:t xml:space="preserve">3</w:t>
+            </w:r>
+          </w:p>
+        </w:tc>
+        <w:tc>
+          <w:tcPr>
+            <w:tcW w:type="dxa" w:w="1504"/>
+            <w:shd w:fill="F2F5F0" w:color="auto" w:val="clear"/>
+          </w:tcPr>
+          <w:p>
+            <w:r>
+              <w:rPr>
+                <w:sz w:val="18"/>
+                <w:szCs w:val="18"/>
+              </w:rPr>
+              <w:t xml:space="preserve">Registrar Custo de Alimentação</w:t>
+            </w:r>
+          </w:p>
+        </w:tc>
+        <w:tc>
+          <w:tcPr>
+            <w:tcW w:type="dxa" w:w="1504"/>
+            <w:shd w:fill="F2F5F0" w:color="auto" w:val="clear"/>
+          </w:tcPr>
+          <w:p>
+            <w:r>
+              <w:rPr>
+                <w:sz w:val="18"/>
+                <w:szCs w:val="18"/>
+              </w:rPr>
+              <w:t xml:space="preserve">Gerado automaticamente ao registrar ou editar um consumo em Alimentar Setores</w:t>
+            </w:r>
+          </w:p>
+        </w:tc>
+        <w:tc>
+          <w:tcPr>
+            <w:tcW w:type="dxa" w:w="1504"/>
+            <w:shd w:fill="F2F5F0" w:color="auto" w:val="clear"/>
+          </w:tcPr>
+          <w:p>
+            <w:r>
+              <w:rPr>
+                <w:sz w:val="18"/>
+                <w:szCs w:val="18"/>
+              </w:rPr>
+              <w:t xml:space="preserve">Automático</w:t>
+            </w:r>
+          </w:p>
+        </w:tc>
+        <w:tc>
+          <w:tcPr>
+            <w:tcW w:type="dxa" w:w="1504"/>
+            <w:shd w:fill="F2F5F0" w:color="auto" w:val="clear"/>
+          </w:tcPr>
+          <w:p>
+            <w:r>
+              <w:rPr>
+                <w:sz w:val="18"/>
+                <w:szCs w:val="18"/>
+              </w:rPr>
+              <w:t xml:space="preserve">Consumo com rateio por animal</w:t>
+            </w:r>
+          </w:p>
+        </w:tc>
+        <w:tc>
+          <w:tcPr>
+            <w:tcW w:type="dxa" w:w="1504"/>
+            <w:shd w:fill="F2F5F0" w:color="auto" w:val="clear"/>
+          </w:tcPr>
+          <w:p>
+            <w:r>
+              <w:rPr>
+                <w:sz w:val="18"/>
+                <w:szCs w:val="18"/>
+              </w:rPr>
+              <w:t xml:space="preserve">Reemitido (estornado e recriado) ao editar o consumo de origem</w:t>
+            </w:r>
+          </w:p>
+        </w:tc>
+      </w:tr>
+      <w:tr>
+        <w:tc>
+          <w:tcPr>
+            <w:tcW w:type="dxa" w:w="1504"/>
+            <w:shd w:fill="FFFFFF" w:color="auto" w:val="clear"/>
+          </w:tcPr>
+          <w:p>
+            <w:r>
+              <w:rPr>
+                <w:sz w:val="18"/>
+                <w:szCs w:val="18"/>
+              </w:rPr>
+              <w:t xml:space="preserve">4</w:t>
+            </w:r>
+          </w:p>
+        </w:tc>
+        <w:tc>
+          <w:tcPr>
+            <w:tcW w:type="dxa" w:w="1504"/>
+            <w:shd w:fill="FFFFFF" w:color="auto" w:val="clear"/>
+          </w:tcPr>
+          <w:p>
+            <w:r>
+              <w:rPr>
+                <w:sz w:val="18"/>
+                <w:szCs w:val="18"/>
+              </w:rPr>
+              <w:t xml:space="preserve">Registrar Custo de Vacinação</w:t>
+            </w:r>
+          </w:p>
+        </w:tc>
+        <w:tc>
+          <w:tcPr>
+            <w:tcW w:type="dxa" w:w="1504"/>
+            <w:shd w:fill="FFFFFF" w:color="auto" w:val="clear"/>
+          </w:tcPr>
+          <w:p>
+            <w:r>
+              <w:rPr>
+                <w:sz w:val="18"/>
+                <w:szCs w:val="18"/>
+              </w:rPr>
+              <w:t xml:space="preserve">Gerado automaticamente ao registrar uma aplicação em Vacinar Animais</w:t>
+            </w:r>
+          </w:p>
+        </w:tc>
+        <w:tc>
+          <w:tcPr>
+            <w:tcW w:type="dxa" w:w="1504"/>
+            <w:shd w:fill="FFFFFF" w:color="auto" w:val="clear"/>
+          </w:tcPr>
+          <w:p>
+            <w:r>
+              <w:rPr>
+                <w:sz w:val="18"/>
+                <w:szCs w:val="18"/>
+              </w:rPr>
+              <w:t xml:space="preserve">Automático</w:t>
+            </w:r>
+          </w:p>
+        </w:tc>
+        <w:tc>
+          <w:tcPr>
+            <w:tcW w:type="dxa" w:w="1504"/>
+            <w:shd w:fill="FFFFFF" w:color="auto" w:val="clear"/>
+          </w:tcPr>
+          <w:p>
+            <w:r>
+              <w:rPr>
+                <w:sz w:val="18"/>
+                <w:szCs w:val="18"/>
+              </w:rPr>
+              <w:t xml:space="preserve">Item de vacinação por animal</w:t>
+            </w:r>
+          </w:p>
+        </w:tc>
+        <w:tc>
+          <w:tcPr>
+            <w:tcW w:type="dxa" w:w="1504"/>
+            <w:shd w:fill="FFFFFF" w:color="auto" w:val="clear"/>
+          </w:tcPr>
+          <w:p>
+            <w:r>
+              <w:rPr>
+                <w:sz w:val="18"/>
+                <w:szCs w:val="18"/>
+              </w:rPr>
+              <w:t xml:space="preserve">Estornado ao cancelar ou editar a aplicação de origem</w:t>
+            </w:r>
+          </w:p>
+        </w:tc>
+      </w:tr>
+    </w:tbl>
+    <w:p>
+      <w:pPr>
+        <w:spacing w:after="160"/>
+      </w:pPr>
+    </w:p>
+    <w:p>
+      <w:pPr>
+        <w:spacing w:after="160"/>
+      </w:pPr>
+      <w:r>
+        <w:rPr>
+          <w:b/>
+          <w:bCs/>
+        </w:rPr>
+        <w:t xml:space="preserve">Cenário</w:t>
+      </w:r>
+    </w:p>
+    <w:p>
+      <w:pPr>
+        <w:spacing w:after="160"/>
+      </w:pPr>
+      <w:r>
+        <w:t xml:space="preserve">No cadastro do animal, o usuário pode informar (opcionalmente) o valor e a data de aquisição — campos deixados em branco quando o animal nasceu na própria fazenda. A partir daí, cada alimentação e vacinação aplicada ao animal gera um novo lançamento de custo com o preço do insumo fotografado naquele momento. O usuário consulta o total acumulado e o histórico de eventos na tela de detalhes do animal, e o total agregado dos animais atualmente alocados na tela de detalhes do lote.</w:t>
+      </w:r>
+    </w:p>
+    <w:p>
+      <w:pPr>
+        <w:spacing w:after="160"/>
+      </w:pPr>
+      <w:r>
+        <w:rPr>
+          <w:b/>
+          <w:bCs/>
+        </w:rPr>
+        <w:t xml:space="preserve">Pré-condições</w:t>
+      </w:r>
+    </w:p>
+    <w:p>
+      <w:pPr>
+        <w:spacing w:after="160"/>
+      </w:pPr>
+      <w:r>
+        <w:t xml:space="preserve">O usuário deve estar autenticado; o animal (ou lote) consultado deve existir e estar ativo.</w:t>
+      </w:r>
+    </w:p>
+    <w:p>
+      <w:pPr>
+        <w:spacing w:after="160"/>
+      </w:pPr>
+      <w:r>
+        <w:rPr>
+          <w:b/>
+          <w:bCs/>
+        </w:rPr>
+        <w:t xml:space="preserve">Fluxo Principal</w:t>
+      </w:r>
+    </w:p>
+    <w:p>
+      <w:pPr>
+        <w:pStyle w:val="ListParagraph"/>
+        <w:numPr>
+          <w:ilvl w:val="0"/>
+          <w:numId w:val="2"/>
+        </w:numPr>
+        <w:spacing w:after="80"/>
+      </w:pPr>
+      <w:r>
+        <w:t xml:space="preserve">O usuário cadastra um animal, informando opcionalmente o valor e a data de aquisição (UC03).</w:t>
+      </w:r>
+    </w:p>
+    <w:p>
+      <w:pPr>
+        <w:pStyle w:val="ListParagraph"/>
+        <w:numPr>
+          <w:ilvl w:val="0"/>
+          <w:numId w:val="2"/>
+        </w:numPr>
+        <w:spacing w:after="80"/>
+      </w:pPr>
+      <w:r>
+        <w:t xml:space="preserve">A cada "Alimentar Setores" (UC08) ou "Vacinar Animais" (UC10) aplicado ao animal, o sistema fotografa o preço do insumo no momento e grava um lançamento de custo vinculado a ele.</w:t>
+      </w:r>
+    </w:p>
+    <w:p>
+      <w:pPr>
+        <w:pStyle w:val="ListParagraph"/>
+        <w:numPr>
+          <w:ilvl w:val="0"/>
+          <w:numId w:val="2"/>
+        </w:numPr>
+        <w:spacing w:after="80"/>
+      </w:pPr>
+      <w:r>
+        <w:t xml:space="preserve">O usuário abre Animais → Detalhes do Animal e consulta a seção "Custo de vida", com os totais por categoria (Aquisição, Alimentação, Vacinação) e a lista de eventos.</w:t>
+      </w:r>
+    </w:p>
+    <w:p>
+      <w:pPr>
+        <w:pStyle w:val="ListParagraph"/>
+        <w:numPr>
+          <w:ilvl w:val="0"/>
+          <w:numId w:val="2"/>
+        </w:numPr>
+        <w:spacing w:after="80"/>
+      </w:pPr>
+      <w:r>
+        <w:t xml:space="preserve">O usuário abre Lotes → Detalhes do Lote e consulta a seção "Custo total do lote", somando o ledger de cada animal atualmente alocado.</w:t>
+      </w:r>
+    </w:p>
+    <w:p>
+      <w:pPr>
+        <w:pStyle w:val="ListParagraph"/>
+        <w:numPr>
+          <w:ilvl w:val="0"/>
+          <w:numId w:val="2"/>
+        </w:numPr>
+        <w:spacing w:after="80"/>
+      </w:pPr>
+      <w:r>
+        <w:t xml:space="preserve">Ao transferir o animal para outro lote (UC04), seu histórico de custo continua associado a ele e passa a contar no total do novo lote.</w:t>
+      </w:r>
+    </w:p>
+    <w:p>
+      <w:pPr>
+        <w:spacing w:after="160"/>
+      </w:pPr>
+      <w:r>
+        <w:rPr>
+          <w:b/>
+          <w:bCs/>
+        </w:rPr>
+        <w:t xml:space="preserve">Subfluxo</w:t>
+      </w:r>
+    </w:p>
+    <w:p>
+      <w:pPr>
+        <w:pStyle w:val="ListParagraph"/>
+        <w:numPr>
+          <w:ilvl w:val="0"/>
+          <w:numId w:val="1"/>
+        </w:numPr>
+        <w:spacing w:after="80"/>
+      </w:pPr>
+      <w:r>
+        <w:rPr>
+          <w:b/>
+          <w:bCs/>
+        </w:rPr>
+        <w:t xml:space="preserve">SF01: Animal sem valor de aquisição informado — Nenhum lançamento de Aquisição é gerado; o animal é tratado como nascido na própria fazenda.</w:t>
+      </w:r>
+    </w:p>
+    <w:p>
+      <w:pPr>
+        <w:pStyle w:val="ListParagraph"/>
+        <w:numPr>
+          <w:ilvl w:val="0"/>
+          <w:numId w:val="1"/>
+        </w:numPr>
+        <w:spacing w:after="80"/>
+      </w:pPr>
+      <w:r>
+        <w:rPr>
+          <w:b/>
+          <w:bCs/>
+        </w:rPr>
+        <w:t xml:space="preserve">SF02: Edição de um consumo ou de uma aplicação já registrada — O sistema remove o(s) lançamento(s) de custo anteriores daquela origem e recria com os novos valores, sem duplicar.</w:t>
+      </w:r>
+    </w:p>
+    <w:p>
+      <w:pPr>
+        <w:pStyle w:val="ListParagraph"/>
+        <w:numPr>
+          <w:ilvl w:val="0"/>
+          <w:numId w:val="1"/>
+        </w:numPr>
+        <w:spacing w:after="80"/>
+      </w:pPr>
+      <w:r>
+        <w:rPr>
+          <w:b/>
+          <w:bCs/>
+        </w:rPr>
+        <w:t xml:space="preserve">SF03: Cancelamento de uma aplicação de vacina — O sistema remove o lançamento de custo de vacinação correspondente.</w:t>
+      </w:r>
+    </w:p>
+    <w:p>
+      <w:pPr>
+        <w:pStyle w:val="ListParagraph"/>
+        <w:numPr>
+          <w:ilvl w:val="0"/>
+          <w:numId w:val="1"/>
+        </w:numPr>
+        <w:spacing w:after="80"/>
+      </w:pPr>
+      <w:r>
+        <w:rPr>
+          <w:b/>
+          <w:bCs/>
+        </w:rPr>
+        <w:t xml:space="preserve">SF04: Eventos anteriores à implantação desta funcionalidade — Não possuem lançamento de custo retroativo, pois o preço pago na época não ficou registrado nos lançamentos antigos de consumo/vacinação.</w:t>
+      </w:r>
+    </w:p>
+    <w:p>
+      <w:r>
+        <w:br w:type="page"/>
+      </w:r>
+    </w:p>
+    <w:p>
+      <w:pPr>
+        <w:pStyle w:val="Heading2"/>
+        <w:spacing w:after="160" w:before="280"/>
+      </w:pPr>
+      <w:r>
+        <w:t xml:space="preserve">Especificação do caso de uso UC22: Gráficos de Ocupação e Distribuição</w:t>
+      </w:r>
+    </w:p>
+    <w:p>
+      <w:pPr>
+        <w:spacing w:after="160"/>
+      </w:pPr>
+      <w:r>
+        <w:rPr>
+          <w:i/>
+          <w:iCs/>
+        </w:rPr>
+        <w:t xml:space="preserve">(Módulo novo — não existia no documento v2.1.)</w:t>
+      </w:r>
+    </w:p>
+    <w:p>
+      <w:pPr>
+        <w:spacing w:after="160"/>
+      </w:pPr>
+      <w:r>
+        <w:rPr>
+          <w:b/>
+          <w:bCs/>
+        </w:rPr>
+        <w:t xml:space="preserve">Interface de Usuário: Setores → topo da listagem ("Ocupação dos setores"); Animais → aba Animais ("Animais por raça"); Insumos → aba Catálogo de Produtos ("Insumos por grupo de produto")</w:t>
+      </w:r>
+    </w:p>
+    <w:p>
+      <w:pPr>
+        <w:spacing w:after="160"/>
+      </w:pPr>
+      <w:r>
+        <w:rPr>
+          <w:b/>
+          <w:bCs/>
+        </w:rPr>
+        <w:t xml:space="preserve">Layout Sugerido</w:t>
+      </w:r>
+    </w:p>
+    <w:p>
+      <w:pPr>
+        <w:spacing w:after="160"/>
+      </w:pPr>
+      <w:r>
+        <w:rPr>
+          <w:i/>
+          <w:iCs/>
+        </w:rPr>
+        <w:t xml:space="preserve">(placeholder de layout)</w:t>
+      </w:r>
+    </w:p>
+    <w:p>
+      <w:pPr>
+        <w:spacing w:after="160"/>
+      </w:pPr>
+      <w:r>
+        <w:rPr>
+          <w:b/>
+          <w:bCs/>
+        </w:rPr>
+        <w:t xml:space="preserve">Relacionamento com outras interfaces</w:t>
+      </w:r>
+    </w:p>
+    <w:p>
+      <w:pPr>
+        <w:spacing w:after="160"/>
+      </w:pPr>
+      <w:r>
+        <w:t xml:space="preserve">Três visualizações que resumem dados já existentes nas telas de Setores (UC05), Animais (UC03) e Insumos (UC07): uma barra de ocupação por setor (um segmento colorido por lote alocado, mais um trecho neutro representando a capacidade livre) e dois gráficos de barras horizontais (quantidade de animais por raça; quantidade de produtos por grupo, excluindo o grupo Animais). Clicar em uma barra ou segmento filtra a lista da própria tela por aquela categoria (raça, grupo de produto ou setor); clicar de novo remove o filtro. Não introduz nenhuma tabela nova — usa os mesmos dados já carregados para cada listagem.</w:t>
+      </w:r>
+    </w:p>
+    <w:p>
+      <w:pPr>
+        <w:spacing w:after="160"/>
+      </w:pPr>
+      <w:r>
+        <w:rPr>
+          <w:b/>
+          <w:bCs/>
+        </w:rPr>
+        <w:t xml:space="preserve">Campos — Gráficos</w:t>
+      </w:r>
+    </w:p>
+    <w:tbl>
+      <w:tblPr>
+        <w:tblW w:type="dxa" w:w="9026"/>
+        <w:tblBorders>
+          <w:top w:val="single" w:color="B9C4B4" w:sz="2"/>
+          <w:left w:val="single" w:color="B9C4B4" w:sz="2"/>
+          <w:bottom w:val="single" w:color="B9C4B4" w:sz="2"/>
+          <w:right w:val="single" w:color="B9C4B4" w:sz="2"/>
+          <w:insideH w:val="single" w:color="B9C4B4" w:sz="2"/>
+          <w:insideV w:val="single" w:color="B9C4B4" w:sz="2"/>
+        </w:tblBorders>
+      </w:tblPr>
+      <w:tblGrid>
+        <w:gridCol w:w="100"/>
+        <w:gridCol w:w="100"/>
+        <w:gridCol w:w="100"/>
+        <w:gridCol w:w="100"/>
+        <w:gridCol w:w="100"/>
+        <w:gridCol w:w="100"/>
+        <w:gridCol w:w="100"/>
+      </w:tblGrid>
+      <w:tr>
+        <w:trPr>
+          <w:tblHeader/>
+        </w:trPr>
+        <w:tc>
+          <w:tcPr>
+            <w:tcW w:type="dxa" w:w="1289"/>
+            <w:shd w:fill="2F5233" w:color="auto" w:val="clear"/>
+          </w:tcPr>
+          <w:p>
+            <w:r>
+              <w:rPr>
+                <w:b/>
+                <w:bCs/>
+                <w:color w:val="FFFFFF"/>
+                <w:sz w:val="18"/>
+                <w:szCs w:val="18"/>
+              </w:rPr>
+              <w:t xml:space="preserve">Nº</w:t>
+            </w:r>
+          </w:p>
+        </w:tc>
+        <w:tc>
+          <w:tcPr>
+            <w:tcW w:type="dxa" w:w="1289"/>
+            <w:shd w:fill="2F5233" w:color="auto" w:val="clear"/>
+          </w:tcPr>
+          <w:p>
+            <w:r>
+              <w:rPr>
+                <w:b/>
+                <w:bCs/>
+                <w:color w:val="FFFFFF"/>
+                <w:sz w:val="18"/>
+                <w:szCs w:val="18"/>
+              </w:rPr>
+              <w:t xml:space="preserve">Nome</w:t>
+            </w:r>
+          </w:p>
+        </w:tc>
+        <w:tc>
+          <w:tcPr>
+            <w:tcW w:type="dxa" w:w="1289"/>
+            <w:shd w:fill="2F5233" w:color="auto" w:val="clear"/>
+          </w:tcPr>
+          <w:p>
+            <w:r>
+              <w:rPr>
+                <w:b/>
+                <w:bCs/>
+                <w:color w:val="FFFFFF"/>
+                <w:sz w:val="18"/>
+                <w:szCs w:val="18"/>
+              </w:rPr>
+              <w:t xml:space="preserve">Descrição</w:t>
+            </w:r>
+          </w:p>
+        </w:tc>
+        <w:tc>
+          <w:tcPr>
+            <w:tcW w:type="dxa" w:w="1289"/>
+            <w:shd w:fill="2F5233" w:color="auto" w:val="clear"/>
+          </w:tcPr>
+          <w:p>
+            <w:r>
+              <w:rPr>
+                <w:b/>
+                <w:bCs/>
+                <w:color w:val="FFFFFF"/>
+                <w:sz w:val="18"/>
+                <w:szCs w:val="18"/>
+              </w:rPr>
+              <w:t xml:space="preserve">Grupo</w:t>
+            </w:r>
+          </w:p>
+        </w:tc>
+        <w:tc>
+          <w:tcPr>
+            <w:tcW w:type="dxa" w:w="1289"/>
+            <w:shd w:fill="2F5233" w:color="auto" w:val="clear"/>
+          </w:tcPr>
+          <w:p>
+            <w:r>
+              <w:rPr>
+                <w:b/>
+                <w:bCs/>
+                <w:color w:val="FFFFFF"/>
+                <w:sz w:val="18"/>
+                <w:szCs w:val="18"/>
+              </w:rPr>
+              <w:t xml:space="preserve">Requisitos de Conteúdo</w:t>
+            </w:r>
+          </w:p>
+        </w:tc>
+        <w:tc>
+          <w:tcPr>
+            <w:tcW w:type="dxa" w:w="1289"/>
+            <w:shd w:fill="2F5233" w:color="auto" w:val="clear"/>
+          </w:tcPr>
+          <w:p>
+            <w:r>
+              <w:rPr>
+                <w:b/>
+                <w:bCs/>
+                <w:color w:val="FFFFFF"/>
+                <w:sz w:val="18"/>
+                <w:szCs w:val="18"/>
+              </w:rPr>
+              <w:t xml:space="preserve">Requisitos de Edição</w:t>
+            </w:r>
+          </w:p>
+        </w:tc>
+        <w:tc>
+          <w:tcPr>
+            <w:tcW w:type="dxa" w:w="1289"/>
+            <w:shd w:fill="2F5233" w:color="auto" w:val="clear"/>
+          </w:tcPr>
+          <w:p>
+            <w:r>
+              <w:rPr>
+                <w:b/>
+                <w:bCs/>
+                <w:color w:val="FFFFFF"/>
+                <w:sz w:val="18"/>
+                <w:szCs w:val="18"/>
+              </w:rPr>
+              <w:t xml:space="preserve">Requisitos Diversos</w:t>
+            </w:r>
+          </w:p>
+        </w:tc>
+      </w:tr>
+      <w:tr>
+        <w:tc>
+          <w:tcPr>
+            <w:tcW w:type="dxa" w:w="1289"/>
+            <w:shd w:fill="F2F5F0" w:color="auto" w:val="clear"/>
+          </w:tcPr>
+          <w:p>
+            <w:r>
+              <w:rPr>
+                <w:sz w:val="18"/>
+                <w:szCs w:val="18"/>
+              </w:rPr>
+              <w:t xml:space="preserve">1</w:t>
+            </w:r>
+          </w:p>
+        </w:tc>
+        <w:tc>
+          <w:tcPr>
+            <w:tcW w:type="dxa" w:w="1289"/>
+            <w:shd w:fill="F2F5F0" w:color="auto" w:val="clear"/>
+          </w:tcPr>
+          <w:p>
+            <w:r>
+              <w:rPr>
+                <w:sz w:val="18"/>
+                <w:szCs w:val="18"/>
+              </w:rPr>
+              <w:t xml:space="preserve">Ocupação do Setor</w:t>
+            </w:r>
+          </w:p>
+        </w:tc>
+        <w:tc>
+          <w:tcPr>
+            <w:tcW w:type="dxa" w:w="1289"/>
+            <w:shd w:fill="F2F5F0" w:color="auto" w:val="clear"/>
+          </w:tcPr>
+          <w:p>
+            <w:r>
+              <w:rPr>
+                <w:sz w:val="18"/>
+                <w:szCs w:val="18"/>
+              </w:rPr>
+              <w:t xml:space="preserve">Barra com a capacidade do setor (fundo neutro) e um segmento colorido por lote alocado</w:t>
+            </w:r>
+          </w:p>
+        </w:tc>
+        <w:tc>
+          <w:tcPr>
+            <w:tcW w:type="dxa" w:w="1289"/>
+            <w:shd w:fill="F2F5F0" w:color="auto" w:val="clear"/>
+          </w:tcPr>
+          <w:p>
+            <w:r>
+              <w:rPr>
+                <w:sz w:val="18"/>
+                <w:szCs w:val="18"/>
+              </w:rPr>
+              <w:t xml:space="preserve">Setores</w:t>
+            </w:r>
+          </w:p>
+        </w:tc>
+        <w:tc>
+          <w:tcPr>
+            <w:tcW w:type="dxa" w:w="1289"/>
+            <w:shd w:fill="F2F5F0" w:color="auto" w:val="clear"/>
+          </w:tcPr>
+          <w:p>
+            <w:r>
+              <w:rPr>
+                <w:sz w:val="18"/>
+                <w:szCs w:val="18"/>
+              </w:rPr>
+              <w:t xml:space="preserve">Animais por lote convertidos em % da capacidade</w:t>
+            </w:r>
+          </w:p>
+        </w:tc>
+        <w:tc>
+          <w:tcPr>
+            <w:tcW w:type="dxa" w:w="1289"/>
+            <w:shd w:fill="F2F5F0" w:color="auto" w:val="clear"/>
+          </w:tcPr>
+          <w:p>
+            <w:r>
+              <w:rPr>
+                <w:sz w:val="18"/>
+                <w:szCs w:val="18"/>
+              </w:rPr>
+              <w:t xml:space="preserve">Somente leitura</w:t>
+            </w:r>
+          </w:p>
+        </w:tc>
+        <w:tc>
+          <w:tcPr>
+            <w:tcW w:type="dxa" w:w="1289"/>
+            <w:shd w:fill="F2F5F0" w:color="auto" w:val="clear"/>
+          </w:tcPr>
+          <w:p>
+            <w:r>
+              <w:rPr>
+                <w:sz w:val="18"/>
+                <w:szCs w:val="18"/>
+              </w:rPr>
+              <w:t xml:space="preserve">Clique no segmento filtra a tabela de setores por aquele setor</w:t>
+            </w:r>
+          </w:p>
+        </w:tc>
+      </w:tr>
+      <w:tr>
+        <w:tc>
+          <w:tcPr>
+            <w:tcW w:type="dxa" w:w="1289"/>
+            <w:shd w:fill="FFFFFF" w:color="auto" w:val="clear"/>
+          </w:tcPr>
+          <w:p>
+            <w:r>
+              <w:rPr>
+                <w:sz w:val="18"/>
+                <w:szCs w:val="18"/>
+              </w:rPr>
+              <w:t xml:space="preserve">2</w:t>
+            </w:r>
+          </w:p>
+        </w:tc>
+        <w:tc>
+          <w:tcPr>
+            <w:tcW w:type="dxa" w:w="1289"/>
+            <w:shd w:fill="FFFFFF" w:color="auto" w:val="clear"/>
+          </w:tcPr>
+          <w:p>
+            <w:r>
+              <w:rPr>
+                <w:sz w:val="18"/>
+                <w:szCs w:val="18"/>
+              </w:rPr>
+              <w:t xml:space="preserve">Animais por Raça</w:t>
+            </w:r>
+          </w:p>
+        </w:tc>
+        <w:tc>
+          <w:tcPr>
+            <w:tcW w:type="dxa" w:w="1289"/>
+            <w:shd w:fill="FFFFFF" w:color="auto" w:val="clear"/>
+          </w:tcPr>
+          <w:p>
+            <w:r>
+              <w:rPr>
+                <w:sz w:val="18"/>
+                <w:szCs w:val="18"/>
+              </w:rPr>
+              <w:t xml:space="preserve">Barra horizontal com a quantidade de animais ATIVO/OBSERVACAO de cada raça</w:t>
+            </w:r>
+          </w:p>
+        </w:tc>
+        <w:tc>
+          <w:tcPr>
+            <w:tcW w:type="dxa" w:w="1289"/>
+            <w:shd w:fill="FFFFFF" w:color="auto" w:val="clear"/>
+          </w:tcPr>
+          <w:p>
+            <w:r>
+              <w:rPr>
+                <w:sz w:val="18"/>
+                <w:szCs w:val="18"/>
+              </w:rPr>
+              <w:t xml:space="preserve">Animais</w:t>
+            </w:r>
+          </w:p>
+        </w:tc>
+        <w:tc>
+          <w:tcPr>
+            <w:tcW w:type="dxa" w:w="1289"/>
+            <w:shd w:fill="FFFFFF" w:color="auto" w:val="clear"/>
+          </w:tcPr>
+          <w:p>
+            <w:r>
+              <w:rPr>
+                <w:sz w:val="18"/>
+                <w:szCs w:val="18"/>
+              </w:rPr>
+              <w:t xml:space="preserve">Calculado a partir da lista de animais já carregada</w:t>
+            </w:r>
+          </w:p>
+        </w:tc>
+        <w:tc>
+          <w:tcPr>
+            <w:tcW w:type="dxa" w:w="1289"/>
+            <w:shd w:fill="FFFFFF" w:color="auto" w:val="clear"/>
+          </w:tcPr>
+          <w:p>
+            <w:r>
+              <w:rPr>
+                <w:sz w:val="18"/>
+                <w:szCs w:val="18"/>
+              </w:rPr>
+              <w:t xml:space="preserve">Somente leitura</w:t>
+            </w:r>
+          </w:p>
+        </w:tc>
+        <w:tc>
+          <w:tcPr>
+            <w:tcW w:type="dxa" w:w="1289"/>
+            <w:shd w:fill="FFFFFF" w:color="auto" w:val="clear"/>
+          </w:tcPr>
+          <w:p>
+            <w:r>
+              <w:rPr>
+                <w:sz w:val="18"/>
+                <w:szCs w:val="18"/>
+              </w:rPr>
+              <w:t xml:space="preserve">Clique na barra filtra a tabela de animais por aquela raça</w:t>
+            </w:r>
+          </w:p>
+        </w:tc>
+      </w:tr>
+      <w:tr>
+        <w:tc>
+          <w:tcPr>
+            <w:tcW w:type="dxa" w:w="1289"/>
+            <w:shd w:fill="F2F5F0" w:color="auto" w:val="clear"/>
+          </w:tcPr>
+          <w:p>
+            <w:r>
+              <w:rPr>
+                <w:sz w:val="18"/>
+                <w:szCs w:val="18"/>
+              </w:rPr>
+              <w:t xml:space="preserve">3</w:t>
+            </w:r>
+          </w:p>
+        </w:tc>
+        <w:tc>
+          <w:tcPr>
+            <w:tcW w:type="dxa" w:w="1289"/>
+            <w:shd w:fill="F2F5F0" w:color="auto" w:val="clear"/>
+          </w:tcPr>
+          <w:p>
+            <w:r>
+              <w:rPr>
+                <w:sz w:val="18"/>
+                <w:szCs w:val="18"/>
+              </w:rPr>
+              <w:t xml:space="preserve">Insumos por Grupo</w:t>
+            </w:r>
+          </w:p>
+        </w:tc>
+        <w:tc>
+          <w:tcPr>
+            <w:tcW w:type="dxa" w:w="1289"/>
+            <w:shd w:fill="F2F5F0" w:color="auto" w:val="clear"/>
+          </w:tcPr>
+          <w:p>
+            <w:r>
+              <w:rPr>
+                <w:sz w:val="18"/>
+                <w:szCs w:val="18"/>
+              </w:rPr>
+              <w:t xml:space="preserve">Barra horizontal com a quantidade de produtos cadastrados em cada grupo (exceto Animais)</w:t>
+            </w:r>
+          </w:p>
+        </w:tc>
+        <w:tc>
+          <w:tcPr>
+            <w:tcW w:type="dxa" w:w="1289"/>
+            <w:shd w:fill="F2F5F0" w:color="auto" w:val="clear"/>
+          </w:tcPr>
+          <w:p>
+            <w:r>
+              <w:rPr>
+                <w:sz w:val="18"/>
+                <w:szCs w:val="18"/>
+              </w:rPr>
+              <w:t xml:space="preserve">Insumos</w:t>
+            </w:r>
+          </w:p>
+        </w:tc>
+        <w:tc>
+          <w:tcPr>
+            <w:tcW w:type="dxa" w:w="1289"/>
+            <w:shd w:fill="F2F5F0" w:color="auto" w:val="clear"/>
+          </w:tcPr>
+          <w:p>
+            <w:r>
+              <w:rPr>
+                <w:sz w:val="18"/>
+                <w:szCs w:val="18"/>
+              </w:rPr>
+              <w:t xml:space="preserve">Calculado a partir do catálogo de produtos já carregado</w:t>
+            </w:r>
+          </w:p>
+        </w:tc>
+        <w:tc>
+          <w:tcPr>
+            <w:tcW w:type="dxa" w:w="1289"/>
+            <w:shd w:fill="F2F5F0" w:color="auto" w:val="clear"/>
+          </w:tcPr>
+          <w:p>
+            <w:r>
+              <w:rPr>
+                <w:sz w:val="18"/>
+                <w:szCs w:val="18"/>
+              </w:rPr>
+              <w:t xml:space="preserve">Somente leitura</w:t>
+            </w:r>
+          </w:p>
+        </w:tc>
+        <w:tc>
+          <w:tcPr>
+            <w:tcW w:type="dxa" w:w="1289"/>
+            <w:shd w:fill="F2F5F0" w:color="auto" w:val="clear"/>
+          </w:tcPr>
+          <w:p>
+            <w:r>
+              <w:rPr>
+                <w:sz w:val="18"/>
+                <w:szCs w:val="18"/>
+              </w:rPr>
+              <w:t xml:space="preserve">Clique na barra filtra o catálogo por aquele grupo</w:t>
+            </w:r>
+          </w:p>
+        </w:tc>
+      </w:tr>
+      <w:tr>
+        <w:tc>
+          <w:tcPr>
+            <w:tcW w:type="dxa" w:w="1289"/>
+            <w:shd w:fill="FFFFFF" w:color="auto" w:val="clear"/>
+          </w:tcPr>
+          <w:p>
+            <w:r>
+              <w:rPr>
+                <w:sz w:val="18"/>
+                <w:szCs w:val="18"/>
+              </w:rPr>
+              <w:t xml:space="preserve">4</w:t>
+            </w:r>
+          </w:p>
+        </w:tc>
+        <w:tc>
+          <w:tcPr>
+            <w:tcW w:type="dxa" w:w="1289"/>
+            <w:shd w:fill="FFFFFF" w:color="auto" w:val="clear"/>
+          </w:tcPr>
+          <w:p>
+            <w:r>
+              <w:rPr>
+                <w:sz w:val="18"/>
+                <w:szCs w:val="18"/>
+              </w:rPr>
+              <w:t xml:space="preserve">Cor da Categoria</w:t>
+            </w:r>
+          </w:p>
+        </w:tc>
+        <w:tc>
+          <w:tcPr>
+            <w:tcW w:type="dxa" w:w="1289"/>
+            <w:shd w:fill="FFFFFF" w:color="auto" w:val="clear"/>
+          </w:tcPr>
+          <w:p>
+            <w:r>
+              <w:rPr>
+                <w:sz w:val="18"/>
+                <w:szCs w:val="18"/>
+              </w:rPr>
+              <w:t xml:space="preserve">Cor atribuída a cada lote, raça ou grupo</w:t>
+            </w:r>
+          </w:p>
+        </w:tc>
+        <w:tc>
+          <w:tcPr>
+            <w:tcW w:type="dxa" w:w="1289"/>
+            <w:shd w:fill="FFFFFF" w:color="auto" w:val="clear"/>
+          </w:tcPr>
+          <w:p>
+            <w:r>
+              <w:rPr>
+                <w:sz w:val="18"/>
+                <w:szCs w:val="18"/>
+              </w:rPr>
+              <w:t xml:space="preserve">Visual</w:t>
+            </w:r>
+          </w:p>
+        </w:tc>
+        <w:tc>
+          <w:tcPr>
+            <w:tcW w:type="dxa" w:w="1289"/>
+            <w:shd w:fill="FFFFFF" w:color="auto" w:val="clear"/>
+          </w:tcPr>
+          <w:p>
+            <w:r>
+              <w:rPr>
+                <w:sz w:val="18"/>
+                <w:szCs w:val="18"/>
+              </w:rPr>
+              <w:t xml:space="preserve">Paleta fixa de 8 tons, escolhida por hash do nome/id</w:t>
+            </w:r>
+          </w:p>
+        </w:tc>
+        <w:tc>
+          <w:tcPr>
+            <w:tcW w:type="dxa" w:w="1289"/>
+            <w:shd w:fill="FFFFFF" w:color="auto" w:val="clear"/>
+          </w:tcPr>
+          <w:p>
+            <w:r>
+              <w:rPr>
+                <w:sz w:val="18"/>
+                <w:szCs w:val="18"/>
+              </w:rPr>
+              <w:t xml:space="preserve">Somente leitura</w:t>
+            </w:r>
+          </w:p>
+        </w:tc>
+        <w:tc>
+          <w:tcPr>
+            <w:tcW w:type="dxa" w:w="1289"/>
+            <w:shd w:fill="FFFFFF" w:color="auto" w:val="clear"/>
+          </w:tcPr>
+          <w:p>
+            <w:r>
+              <w:rPr>
+                <w:sz w:val="18"/>
+                <w:szCs w:val="18"/>
+              </w:rPr>
+              <w:t xml:space="preserve">Estável entre renderizações; pode repetir após a 8ª categoria simultânea</w:t>
+            </w:r>
+          </w:p>
+        </w:tc>
+      </w:tr>
+      <w:tr>
+        <w:tc>
+          <w:tcPr>
+            <w:tcW w:type="dxa" w:w="1289"/>
+            <w:shd w:fill="F2F5F0" w:color="auto" w:val="clear"/>
+          </w:tcPr>
+          <w:p>
+            <w:r>
+              <w:rPr>
+                <w:sz w:val="18"/>
+                <w:szCs w:val="18"/>
+              </w:rPr>
+              <w:t xml:space="preserve">5</w:t>
+            </w:r>
+          </w:p>
+        </w:tc>
+        <w:tc>
+          <w:tcPr>
+            <w:tcW w:type="dxa" w:w="1289"/>
+            <w:shd w:fill="F2F5F0" w:color="auto" w:val="clear"/>
+          </w:tcPr>
+          <w:p>
+            <w:r>
+              <w:rPr>
+                <w:sz w:val="18"/>
+                <w:szCs w:val="18"/>
+              </w:rPr>
+              <w:t xml:space="preserve">Filtro Ativo</w:t>
+            </w:r>
+          </w:p>
+        </w:tc>
+        <w:tc>
+          <w:tcPr>
+            <w:tcW w:type="dxa" w:w="1289"/>
+            <w:shd w:fill="F2F5F0" w:color="auto" w:val="clear"/>
+          </w:tcPr>
+          <w:p>
+            <w:r>
+              <w:rPr>
+                <w:sz w:val="18"/>
+                <w:szCs w:val="18"/>
+              </w:rPr>
+              <w:t xml:space="preserve">Indicação de qual categoria está filtrando a lista abaixo do gráfico</w:t>
+            </w:r>
+          </w:p>
+        </w:tc>
+        <w:tc>
+          <w:tcPr>
+            <w:tcW w:type="dxa" w:w="1289"/>
+            <w:shd w:fill="F2F5F0" w:color="auto" w:val="clear"/>
+          </w:tcPr>
+          <w:p>
+            <w:r>
+              <w:rPr>
+                <w:sz w:val="18"/>
+                <w:szCs w:val="18"/>
+              </w:rPr>
+              <w:t xml:space="preserve">Visual</w:t>
+            </w:r>
+          </w:p>
+        </w:tc>
+        <w:tc>
+          <w:tcPr>
+            <w:tcW w:type="dxa" w:w="1289"/>
+            <w:shd w:fill="F2F5F0" w:color="auto" w:val="clear"/>
+          </w:tcPr>
+          <w:p>
+            <w:r>
+              <w:rPr>
+                <w:sz w:val="18"/>
+                <w:szCs w:val="18"/>
+              </w:rPr>
+              <w:t xml:space="preserve">Texto "Filtrando por: X" com botão de limpar</w:t>
+            </w:r>
+          </w:p>
+        </w:tc>
+        <w:tc>
+          <w:tcPr>
+            <w:tcW w:type="dxa" w:w="1289"/>
+            <w:shd w:fill="F2F5F0" w:color="auto" w:val="clear"/>
+          </w:tcPr>
+          <w:p>
+            <w:r>
+              <w:rPr>
+                <w:sz w:val="18"/>
+                <w:szCs w:val="18"/>
+              </w:rPr>
+              <w:t xml:space="preserve">Somente leitura</w:t>
+            </w:r>
+          </w:p>
+        </w:tc>
+        <w:tc>
+          <w:tcPr>
+            <w:tcW w:type="dxa" w:w="1289"/>
+            <w:shd w:fill="F2F5F0" w:color="auto" w:val="clear"/>
+          </w:tcPr>
+          <w:p>
+            <w:r>
+              <w:rPr>
+                <w:sz w:val="18"/>
+                <w:szCs w:val="18"/>
+              </w:rPr>
+              <w:t xml:space="preserve">Clicar de novo na mesma barra remove o filtro</w:t>
+            </w:r>
+          </w:p>
+        </w:tc>
+      </w:tr>
+    </w:tbl>
+    <w:p>
+      <w:pPr>
+        <w:spacing w:after="160"/>
+      </w:pPr>
+    </w:p>
+    <w:p>
+      <w:pPr>
+        <w:spacing w:after="160"/>
+      </w:pPr>
+      <w:r>
+        <w:rPr>
+          <w:b/>
+          <w:bCs/>
+        </w:rPr>
+        <w:t xml:space="preserve">Campos — Paleta de Cores</w:t>
+      </w:r>
+    </w:p>
+    <w:tbl>
+      <w:tblPr>
+        <w:tblW w:type="dxa" w:w="9026"/>
+        <w:tblBorders>
+          <w:top w:val="single" w:color="B9C4B4" w:sz="2"/>
+          <w:left w:val="single" w:color="B9C4B4" w:sz="2"/>
+          <w:bottom w:val="single" w:color="B9C4B4" w:sz="2"/>
+          <w:right w:val="single" w:color="B9C4B4" w:sz="2"/>
+          <w:insideH w:val="single" w:color="B9C4B4" w:sz="2"/>
+          <w:insideV w:val="single" w:color="B9C4B4" w:sz="2"/>
+        </w:tblBorders>
+      </w:tblPr>
+      <w:tblGrid>
+        <w:gridCol w:w="100"/>
+        <w:gridCol w:w="100"/>
+        <w:gridCol w:w="100"/>
+        <w:gridCol w:w="100"/>
+        <w:gridCol w:w="100"/>
+        <w:gridCol w:w="100"/>
+        <w:gridCol w:w="100"/>
+      </w:tblGrid>
+      <w:tr>
+        <w:trPr>
+          <w:tblHeader/>
+        </w:trPr>
+        <w:tc>
+          <w:tcPr>
+            <w:tcW w:type="dxa" w:w="1289"/>
+            <w:shd w:fill="2F5233" w:color="auto" w:val="clear"/>
+          </w:tcPr>
+          <w:p>
+            <w:r>
+              <w:rPr>
+                <w:b/>
+                <w:bCs/>
+                <w:color w:val="FFFFFF"/>
+                <w:sz w:val="18"/>
+                <w:szCs w:val="18"/>
+              </w:rPr>
+              <w:t xml:space="preserve">Nº</w:t>
+            </w:r>
+          </w:p>
+        </w:tc>
+        <w:tc>
+          <w:tcPr>
+            <w:tcW w:type="dxa" w:w="1289"/>
+            <w:shd w:fill="2F5233" w:color="auto" w:val="clear"/>
+          </w:tcPr>
+          <w:p>
+            <w:r>
+              <w:rPr>
+                <w:b/>
+                <w:bCs/>
+                <w:color w:val="FFFFFF"/>
+                <w:sz w:val="18"/>
+                <w:szCs w:val="18"/>
+              </w:rPr>
+              <w:t xml:space="preserve">Nome</w:t>
+            </w:r>
+          </w:p>
+        </w:tc>
+        <w:tc>
+          <w:tcPr>
+            <w:tcW w:type="dxa" w:w="1289"/>
+            <w:shd w:fill="2F5233" w:color="auto" w:val="clear"/>
+          </w:tcPr>
+          <w:p>
+            <w:r>
+              <w:rPr>
+                <w:b/>
+                <w:bCs/>
+                <w:color w:val="FFFFFF"/>
+                <w:sz w:val="18"/>
+                <w:szCs w:val="18"/>
+              </w:rPr>
+              <w:t xml:space="preserve">Descrição</w:t>
+            </w:r>
+          </w:p>
+        </w:tc>
+        <w:tc>
+          <w:tcPr>
+            <w:tcW w:type="dxa" w:w="1289"/>
+            <w:shd w:fill="2F5233" w:color="auto" w:val="clear"/>
+          </w:tcPr>
+          <w:p>
+            <w:r>
+              <w:rPr>
+                <w:b/>
+                <w:bCs/>
+                <w:color w:val="FFFFFF"/>
+                <w:sz w:val="18"/>
+                <w:szCs w:val="18"/>
+              </w:rPr>
+              <w:t xml:space="preserve">Grupo</w:t>
+            </w:r>
+          </w:p>
+        </w:tc>
+        <w:tc>
+          <w:tcPr>
+            <w:tcW w:type="dxa" w:w="1289"/>
+            <w:shd w:fill="2F5233" w:color="auto" w:val="clear"/>
+          </w:tcPr>
+          <w:p>
+            <w:r>
+              <w:rPr>
+                <w:b/>
+                <w:bCs/>
+                <w:color w:val="FFFFFF"/>
+                <w:sz w:val="18"/>
+                <w:szCs w:val="18"/>
+              </w:rPr>
+              <w:t xml:space="preserve">Requisitos de Conteúdo</w:t>
+            </w:r>
+          </w:p>
+        </w:tc>
+        <w:tc>
+          <w:tcPr>
+            <w:tcW w:type="dxa" w:w="1289"/>
+            <w:shd w:fill="2F5233" w:color="auto" w:val="clear"/>
+          </w:tcPr>
+          <w:p>
+            <w:r>
+              <w:rPr>
+                <w:b/>
+                <w:bCs/>
+                <w:color w:val="FFFFFF"/>
+                <w:sz w:val="18"/>
+                <w:szCs w:val="18"/>
+              </w:rPr>
+              <w:t xml:space="preserve">Requisitos de Edição</w:t>
+            </w:r>
+          </w:p>
+        </w:tc>
+        <w:tc>
+          <w:tcPr>
+            <w:tcW w:type="dxa" w:w="1289"/>
+            <w:shd w:fill="2F5233" w:color="auto" w:val="clear"/>
+          </w:tcPr>
+          <w:p>
+            <w:r>
+              <w:rPr>
+                <w:b/>
+                <w:bCs/>
+                <w:color w:val="FFFFFF"/>
+                <w:sz w:val="18"/>
+                <w:szCs w:val="18"/>
+              </w:rPr>
+              <w:t xml:space="preserve">Requisitos Diversos</w:t>
+            </w:r>
+          </w:p>
+        </w:tc>
+      </w:tr>
+      <w:tr>
+        <w:tc>
+          <w:tcPr>
+            <w:tcW w:type="dxa" w:w="1289"/>
+            <w:shd w:fill="F2F5F0" w:color="auto" w:val="clear"/>
+          </w:tcPr>
+          <w:p>
+            <w:r>
+              <w:rPr>
+                <w:sz w:val="18"/>
+                <w:szCs w:val="18"/>
+              </w:rPr>
+              <w:t xml:space="preserve">1</w:t>
+            </w:r>
+          </w:p>
+        </w:tc>
+        <w:tc>
+          <w:tcPr>
+            <w:tcW w:type="dxa" w:w="1289"/>
+            <w:shd w:fill="F2F5F0" w:color="auto" w:val="clear"/>
+          </w:tcPr>
+          <w:p>
+            <w:r>
+              <w:rPr>
+                <w:sz w:val="18"/>
+                <w:szCs w:val="18"/>
+              </w:rPr>
+              <w:t xml:space="preserve">Ramp Clara</w:t>
+            </w:r>
+          </w:p>
+        </w:tc>
+        <w:tc>
+          <w:tcPr>
+            <w:tcW w:type="dxa" w:w="1289"/>
+            <w:shd w:fill="F2F5F0" w:color="auto" w:val="clear"/>
+          </w:tcPr>
+          <w:p>
+            <w:r>
+              <w:rPr>
+                <w:sz w:val="18"/>
+                <w:szCs w:val="18"/>
+              </w:rPr>
+              <w:t xml:space="preserve">8 tons validados para o tema claro</w:t>
+            </w:r>
+          </w:p>
+        </w:tc>
+        <w:tc>
+          <w:tcPr>
+            <w:tcW w:type="dxa" w:w="1289"/>
+            <w:shd w:fill="F2F5F0" w:color="auto" w:val="clear"/>
+          </w:tcPr>
+          <w:p>
+            <w:r>
+              <w:rPr>
+                <w:sz w:val="18"/>
+                <w:szCs w:val="18"/>
+              </w:rPr>
+              <w:t xml:space="preserve">Paleta</w:t>
+            </w:r>
+          </w:p>
+        </w:tc>
+        <w:tc>
+          <w:tcPr>
+            <w:tcW w:type="dxa" w:w="1289"/>
+            <w:shd w:fill="F2F5F0" w:color="auto" w:val="clear"/>
+          </w:tcPr>
+          <w:p>
+            <w:r>
+              <w:rPr>
+                <w:sz w:val="18"/>
+                <w:szCs w:val="18"/>
+              </w:rPr>
+              <w:t xml:space="preserve">Hex fixo</w:t>
+            </w:r>
+          </w:p>
+        </w:tc>
+        <w:tc>
+          <w:tcPr>
+            <w:tcW w:type="dxa" w:w="1289"/>
+            <w:shd w:fill="F2F5F0" w:color="auto" w:val="clear"/>
+          </w:tcPr>
+          <w:p>
+            <w:r>
+              <w:rPr>
+                <w:sz w:val="18"/>
+                <w:szCs w:val="18"/>
+              </w:rPr>
+              <w:t xml:space="preserve">Somente leitura</w:t>
+            </w:r>
+          </w:p>
+        </w:tc>
+        <w:tc>
+          <w:tcPr>
+            <w:tcW w:type="dxa" w:w="1289"/>
+            <w:shd w:fill="F2F5F0" w:color="auto" w:val="clear"/>
+          </w:tcPr>
+          <w:p>
+            <w:r>
+              <w:rPr>
+                <w:sz w:val="18"/>
+                <w:szCs w:val="18"/>
+              </w:rPr>
+              <w:t xml:space="preserve">Cores e contraste validados por script (ver skill de visualização de dados)</w:t>
+            </w:r>
+          </w:p>
+        </w:tc>
+      </w:tr>
+      <w:tr>
+        <w:tc>
+          <w:tcPr>
+            <w:tcW w:type="dxa" w:w="1289"/>
+            <w:shd w:fill="FFFFFF" w:color="auto" w:val="clear"/>
+          </w:tcPr>
+          <w:p>
+            <w:r>
+              <w:rPr>
+                <w:sz w:val="18"/>
+                <w:szCs w:val="18"/>
+              </w:rPr>
+              <w:t xml:space="preserve">2</w:t>
+            </w:r>
+          </w:p>
+        </w:tc>
+        <w:tc>
+          <w:tcPr>
+            <w:tcW w:type="dxa" w:w="1289"/>
+            <w:shd w:fill="FFFFFF" w:color="auto" w:val="clear"/>
+          </w:tcPr>
+          <w:p>
+            <w:r>
+              <w:rPr>
+                <w:sz w:val="18"/>
+                <w:szCs w:val="18"/>
+              </w:rPr>
+              <w:t xml:space="preserve">Ramp Escura</w:t>
+            </w:r>
+          </w:p>
+        </w:tc>
+        <w:tc>
+          <w:tcPr>
+            <w:tcW w:type="dxa" w:w="1289"/>
+            <w:shd w:fill="FFFFFF" w:color="auto" w:val="clear"/>
+          </w:tcPr>
+          <w:p>
+            <w:r>
+              <w:rPr>
+                <w:sz w:val="18"/>
+                <w:szCs w:val="18"/>
+              </w:rPr>
+              <w:t xml:space="preserve">8 tons validados para o tema escuro</w:t>
+            </w:r>
+          </w:p>
+        </w:tc>
+        <w:tc>
+          <w:tcPr>
+            <w:tcW w:type="dxa" w:w="1289"/>
+            <w:shd w:fill="FFFFFF" w:color="auto" w:val="clear"/>
+          </w:tcPr>
+          <w:p>
+            <w:r>
+              <w:rPr>
+                <w:sz w:val="18"/>
+                <w:szCs w:val="18"/>
+              </w:rPr>
+              <w:t xml:space="preserve">Paleta</w:t>
+            </w:r>
+          </w:p>
+        </w:tc>
+        <w:tc>
+          <w:tcPr>
+            <w:tcW w:type="dxa" w:w="1289"/>
+            <w:shd w:fill="FFFFFF" w:color="auto" w:val="clear"/>
+          </w:tcPr>
+          <w:p>
+            <w:r>
+              <w:rPr>
+                <w:sz w:val="18"/>
+                <w:szCs w:val="18"/>
+              </w:rPr>
+              <w:t xml:space="preserve">Hex fixo</w:t>
+            </w:r>
+          </w:p>
+        </w:tc>
+        <w:tc>
+          <w:tcPr>
+            <w:tcW w:type="dxa" w:w="1289"/>
+            <w:shd w:fill="FFFFFF" w:color="auto" w:val="clear"/>
+          </w:tcPr>
+          <w:p>
+            <w:r>
+              <w:rPr>
+                <w:sz w:val="18"/>
+                <w:szCs w:val="18"/>
+              </w:rPr>
+              <w:t xml:space="preserve">Somente leitura</w:t>
+            </w:r>
+          </w:p>
+        </w:tc>
+        <w:tc>
+          <w:tcPr>
+            <w:tcW w:type="dxa" w:w="1289"/>
+            <w:shd w:fill="FFFFFF" w:color="auto" w:val="clear"/>
+          </w:tcPr>
+          <w:p>
+            <w:r>
+              <w:rPr>
+                <w:sz w:val="18"/>
+                <w:szCs w:val="18"/>
+              </w:rPr>
+              <w:t xml:space="preserve">Passos diferentes da ramp clara — não é apenas a cor clara invertida</w:t>
+            </w:r>
+          </w:p>
+        </w:tc>
+      </w:tr>
+    </w:tbl>
+    <w:p>
+      <w:pPr>
+        <w:spacing w:after="160"/>
+      </w:pPr>
+    </w:p>
+    <w:p>
+      <w:pPr>
+        <w:spacing w:after="160"/>
+      </w:pPr>
+      <w:r>
+        <w:rPr>
+          <w:b/>
+          <w:bCs/>
+        </w:rPr>
+        <w:t xml:space="preserve">Comandos</w:t>
+      </w:r>
+    </w:p>
+    <w:tbl>
+      <w:tblPr>
+        <w:tblW w:type="dxa" w:w="9026"/>
+        <w:tblBorders>
+          <w:top w:val="single" w:color="B9C4B4" w:sz="2"/>
+          <w:left w:val="single" w:color="B9C4B4" w:sz="2"/>
+          <w:bottom w:val="single" w:color="B9C4B4" w:sz="2"/>
+          <w:right w:val="single" w:color="B9C4B4" w:sz="2"/>
+          <w:insideH w:val="single" w:color="B9C4B4" w:sz="2"/>
+          <w:insideV w:val="single" w:color="B9C4B4" w:sz="2"/>
+        </w:tblBorders>
+      </w:tblPr>
+      <w:tblGrid>
+        <w:gridCol w:w="100"/>
+        <w:gridCol w:w="100"/>
+        <w:gridCol w:w="100"/>
+        <w:gridCol w:w="100"/>
+        <w:gridCol w:w="100"/>
+        <w:gridCol w:w="100"/>
+      </w:tblGrid>
+      <w:tr>
+        <w:trPr>
+          <w:tblHeader/>
+        </w:trPr>
+        <w:tc>
+          <w:tcPr>
+            <w:tcW w:type="dxa" w:w="1504"/>
+            <w:shd w:fill="2F5233" w:color="auto" w:val="clear"/>
+          </w:tcPr>
+          <w:p>
+            <w:r>
+              <w:rPr>
+                <w:b/>
+                <w:bCs/>
+                <w:color w:val="FFFFFF"/>
+                <w:sz w:val="18"/>
+                <w:szCs w:val="18"/>
+              </w:rPr>
+              <w:t xml:space="preserve">Nº</w:t>
+            </w:r>
+          </w:p>
+        </w:tc>
+        <w:tc>
+          <w:tcPr>
+            <w:tcW w:type="dxa" w:w="1504"/>
+            <w:shd w:fill="2F5233" w:color="auto" w:val="clear"/>
+          </w:tcPr>
+          <w:p>
+            <w:r>
+              <w:rPr>
+                <w:b/>
+                <w:bCs/>
+                <w:color w:val="FFFFFF"/>
+                <w:sz w:val="18"/>
+                <w:szCs w:val="18"/>
+              </w:rPr>
+              <w:t xml:space="preserve">Nome</w:t>
+            </w:r>
+          </w:p>
+        </w:tc>
+        <w:tc>
+          <w:tcPr>
+            <w:tcW w:type="dxa" w:w="1504"/>
+            <w:shd w:fill="2F5233" w:color="auto" w:val="clear"/>
+          </w:tcPr>
+          <w:p>
+            <w:r>
+              <w:rPr>
+                <w:b/>
+                <w:bCs/>
+                <w:color w:val="FFFFFF"/>
+                <w:sz w:val="18"/>
+                <w:szCs w:val="18"/>
+              </w:rPr>
+              <w:t xml:space="preserve">Descrição</w:t>
+            </w:r>
+          </w:p>
+        </w:tc>
+        <w:tc>
+          <w:tcPr>
+            <w:tcW w:type="dxa" w:w="1504"/>
+            <w:shd w:fill="2F5233" w:color="auto" w:val="clear"/>
+          </w:tcPr>
+          <w:p>
+            <w:r>
+              <w:rPr>
+                <w:b/>
+                <w:bCs/>
+                <w:color w:val="FFFFFF"/>
+                <w:sz w:val="18"/>
+                <w:szCs w:val="18"/>
+              </w:rPr>
+              <w:t xml:space="preserve">Grupo</w:t>
+            </w:r>
+          </w:p>
+        </w:tc>
+        <w:tc>
+          <w:tcPr>
+            <w:tcW w:type="dxa" w:w="1504"/>
+            <w:shd w:fill="2F5233" w:color="auto" w:val="clear"/>
+          </w:tcPr>
+          <w:p>
+            <w:r>
+              <w:rPr>
+                <w:b/>
+                <w:bCs/>
+                <w:color w:val="FFFFFF"/>
+                <w:sz w:val="18"/>
+                <w:szCs w:val="18"/>
+              </w:rPr>
+              <w:t xml:space="preserve">Requisitos de Validade</w:t>
+            </w:r>
+          </w:p>
+        </w:tc>
+        <w:tc>
+          <w:tcPr>
+            <w:tcW w:type="dxa" w:w="1504"/>
+            <w:shd w:fill="2F5233" w:color="auto" w:val="clear"/>
+          </w:tcPr>
+          <w:p>
+            <w:r>
+              <w:rPr>
+                <w:b/>
+                <w:bCs/>
+                <w:color w:val="FFFFFF"/>
+                <w:sz w:val="18"/>
+                <w:szCs w:val="18"/>
+              </w:rPr>
+              <w:t xml:space="preserve">Requisitos Diversos</w:t>
+            </w:r>
+          </w:p>
+        </w:tc>
+      </w:tr>
+      <w:tr>
+        <w:tc>
+          <w:tcPr>
+            <w:tcW w:type="dxa" w:w="1504"/>
+            <w:shd w:fill="F2F5F0" w:color="auto" w:val="clear"/>
+          </w:tcPr>
+          <w:p>
+            <w:r>
+              <w:rPr>
+                <w:sz w:val="18"/>
+                <w:szCs w:val="18"/>
+              </w:rPr>
+              <w:t xml:space="preserve">1</w:t>
+            </w:r>
+          </w:p>
+        </w:tc>
+        <w:tc>
+          <w:tcPr>
+            <w:tcW w:type="dxa" w:w="1504"/>
+            <w:shd w:fill="F2F5F0" w:color="auto" w:val="clear"/>
+          </w:tcPr>
+          <w:p>
+            <w:r>
+              <w:rPr>
+                <w:sz w:val="18"/>
+                <w:szCs w:val="18"/>
+              </w:rPr>
+              <w:t xml:space="preserve">Consultar Ocupação dos Setores</w:t>
+            </w:r>
+          </w:p>
+        </w:tc>
+        <w:tc>
+          <w:tcPr>
+            <w:tcW w:type="dxa" w:w="1504"/>
+            <w:shd w:fill="F2F5F0" w:color="auto" w:val="clear"/>
+          </w:tcPr>
+          <w:p>
+            <w:r>
+              <w:rPr>
+                <w:sz w:val="18"/>
+                <w:szCs w:val="18"/>
+              </w:rPr>
+              <w:t xml:space="preserve">Exibe uma barra por setor com os lotes que o ocupam</w:t>
+            </w:r>
+          </w:p>
+        </w:tc>
+        <w:tc>
+          <w:tcPr>
+            <w:tcW w:type="dxa" w:w="1504"/>
+            <w:shd w:fill="F2F5F0" w:color="auto" w:val="clear"/>
+          </w:tcPr>
+          <w:p>
+            <w:r>
+              <w:rPr>
+                <w:sz w:val="18"/>
+                <w:szCs w:val="18"/>
+              </w:rPr>
+              <w:t xml:space="preserve">Consulta</w:t>
+            </w:r>
+          </w:p>
+        </w:tc>
+        <w:tc>
+          <w:tcPr>
+            <w:tcW w:type="dxa" w:w="1504"/>
+            <w:shd w:fill="F2F5F0" w:color="auto" w:val="clear"/>
+          </w:tcPr>
+          <w:p>
+            <w:r>
+              <w:rPr>
+                <w:sz w:val="18"/>
+                <w:szCs w:val="18"/>
+              </w:rPr>
+              <w:t xml:space="preserve">Lista de setores carregada</w:t>
+            </w:r>
+          </w:p>
+        </w:tc>
+        <w:tc>
+          <w:tcPr>
+            <w:tcW w:type="dxa" w:w="1504"/>
+            <w:shd w:fill="F2F5F0" w:color="auto" w:val="clear"/>
+          </w:tcPr>
+          <w:p>
+            <w:r>
+              <w:rPr>
+                <w:sz w:val="18"/>
+                <w:szCs w:val="18"/>
+              </w:rPr>
+              <w:t xml:space="preserve">Dados vêm de GET /setores, já usados pela tabela de setores</w:t>
+            </w:r>
+          </w:p>
+        </w:tc>
+      </w:tr>
+      <w:tr>
+        <w:tc>
+          <w:tcPr>
+            <w:tcW w:type="dxa" w:w="1504"/>
+            <w:shd w:fill="FFFFFF" w:color="auto" w:val="clear"/>
+          </w:tcPr>
+          <w:p>
+            <w:r>
+              <w:rPr>
+                <w:sz w:val="18"/>
+                <w:szCs w:val="18"/>
+              </w:rPr>
+              <w:t xml:space="preserve">2</w:t>
+            </w:r>
+          </w:p>
+        </w:tc>
+        <w:tc>
+          <w:tcPr>
+            <w:tcW w:type="dxa" w:w="1504"/>
+            <w:shd w:fill="FFFFFF" w:color="auto" w:val="clear"/>
+          </w:tcPr>
+          <w:p>
+            <w:r>
+              <w:rPr>
+                <w:sz w:val="18"/>
+                <w:szCs w:val="18"/>
+              </w:rPr>
+              <w:t xml:space="preserve">Consultar Animais por Raça</w:t>
+            </w:r>
+          </w:p>
+        </w:tc>
+        <w:tc>
+          <w:tcPr>
+            <w:tcW w:type="dxa" w:w="1504"/>
+            <w:shd w:fill="FFFFFF" w:color="auto" w:val="clear"/>
+          </w:tcPr>
+          <w:p>
+            <w:r>
+              <w:rPr>
+                <w:sz w:val="18"/>
+                <w:szCs w:val="18"/>
+              </w:rPr>
+              <w:t xml:space="preserve">Exibe a contagem de animais por raça</w:t>
+            </w:r>
+          </w:p>
+        </w:tc>
+        <w:tc>
+          <w:tcPr>
+            <w:tcW w:type="dxa" w:w="1504"/>
+            <w:shd w:fill="FFFFFF" w:color="auto" w:val="clear"/>
+          </w:tcPr>
+          <w:p>
+            <w:r>
+              <w:rPr>
+                <w:sz w:val="18"/>
+                <w:szCs w:val="18"/>
+              </w:rPr>
+              <w:t xml:space="preserve">Consulta</w:t>
+            </w:r>
+          </w:p>
+        </w:tc>
+        <w:tc>
+          <w:tcPr>
+            <w:tcW w:type="dxa" w:w="1504"/>
+            <w:shd w:fill="FFFFFF" w:color="auto" w:val="clear"/>
+          </w:tcPr>
+          <w:p>
+            <w:r>
+              <w:rPr>
+                <w:sz w:val="18"/>
+                <w:szCs w:val="18"/>
+              </w:rPr>
+              <w:t xml:space="preserve">Lista de animais carregada</w:t>
+            </w:r>
+          </w:p>
+        </w:tc>
+        <w:tc>
+          <w:tcPr>
+            <w:tcW w:type="dxa" w:w="1504"/>
+            <w:shd w:fill="FFFFFF" w:color="auto" w:val="clear"/>
+          </w:tcPr>
+          <w:p>
+            <w:r>
+              <w:rPr>
+                <w:sz w:val="18"/>
+                <w:szCs w:val="18"/>
+              </w:rPr>
+              <w:t xml:space="preserve">Calculado no frontend a partir de GET /animais</w:t>
+            </w:r>
+          </w:p>
+        </w:tc>
+      </w:tr>
+      <w:tr>
+        <w:tc>
+          <w:tcPr>
+            <w:tcW w:type="dxa" w:w="1504"/>
+            <w:shd w:fill="F2F5F0" w:color="auto" w:val="clear"/>
+          </w:tcPr>
+          <w:p>
+            <w:r>
+              <w:rPr>
+                <w:sz w:val="18"/>
+                <w:szCs w:val="18"/>
+              </w:rPr>
+              <w:t xml:space="preserve">3</w:t>
+            </w:r>
+          </w:p>
+        </w:tc>
+        <w:tc>
+          <w:tcPr>
+            <w:tcW w:type="dxa" w:w="1504"/>
+            <w:shd w:fill="F2F5F0" w:color="auto" w:val="clear"/>
+          </w:tcPr>
+          <w:p>
+            <w:r>
+              <w:rPr>
+                <w:sz w:val="18"/>
+                <w:szCs w:val="18"/>
+              </w:rPr>
+              <w:t xml:space="preserve">Consultar Insumos por Grupo</w:t>
+            </w:r>
+          </w:p>
+        </w:tc>
+        <w:tc>
+          <w:tcPr>
+            <w:tcW w:type="dxa" w:w="1504"/>
+            <w:shd w:fill="F2F5F0" w:color="auto" w:val="clear"/>
+          </w:tcPr>
+          <w:p>
+            <w:r>
+              <w:rPr>
+                <w:sz w:val="18"/>
+                <w:szCs w:val="18"/>
+              </w:rPr>
+              <w:t xml:space="preserve">Exibe a contagem de produtos por grupo</w:t>
+            </w:r>
+          </w:p>
+        </w:tc>
+        <w:tc>
+          <w:tcPr>
+            <w:tcW w:type="dxa" w:w="1504"/>
+            <w:shd w:fill="F2F5F0" w:color="auto" w:val="clear"/>
+          </w:tcPr>
+          <w:p>
+            <w:r>
+              <w:rPr>
+                <w:sz w:val="18"/>
+                <w:szCs w:val="18"/>
+              </w:rPr>
+              <w:t xml:space="preserve">Consulta</w:t>
+            </w:r>
+          </w:p>
+        </w:tc>
+        <w:tc>
+          <w:tcPr>
+            <w:tcW w:type="dxa" w:w="1504"/>
+            <w:shd w:fill="F2F5F0" w:color="auto" w:val="clear"/>
+          </w:tcPr>
+          <w:p>
+            <w:r>
+              <w:rPr>
+                <w:sz w:val="18"/>
+                <w:szCs w:val="18"/>
+              </w:rPr>
+              <w:t xml:space="preserve">Catálogo de produtos carregado</w:t>
+            </w:r>
+          </w:p>
+        </w:tc>
+        <w:tc>
+          <w:tcPr>
+            <w:tcW w:type="dxa" w:w="1504"/>
+            <w:shd w:fill="F2F5F0" w:color="auto" w:val="clear"/>
+          </w:tcPr>
+          <w:p>
+            <w:r>
+              <w:rPr>
+                <w:sz w:val="18"/>
+                <w:szCs w:val="18"/>
+              </w:rPr>
+              <w:t xml:space="preserve">Calculado no frontend a partir de GET /insumos/estoque; exclui tipo ANIMAL</w:t>
+            </w:r>
+          </w:p>
+        </w:tc>
+      </w:tr>
+      <w:tr>
+        <w:tc>
+          <w:tcPr>
+            <w:tcW w:type="dxa" w:w="1504"/>
+            <w:shd w:fill="FFFFFF" w:color="auto" w:val="clear"/>
+          </w:tcPr>
+          <w:p>
+            <w:r>
+              <w:rPr>
+                <w:sz w:val="18"/>
+                <w:szCs w:val="18"/>
+              </w:rPr>
+              <w:t xml:space="preserve">4</w:t>
+            </w:r>
+          </w:p>
+        </w:tc>
+        <w:tc>
+          <w:tcPr>
+            <w:tcW w:type="dxa" w:w="1504"/>
+            <w:shd w:fill="FFFFFF" w:color="auto" w:val="clear"/>
+          </w:tcPr>
+          <w:p>
+            <w:r>
+              <w:rPr>
+                <w:sz w:val="18"/>
+                <w:szCs w:val="18"/>
+              </w:rPr>
+              <w:t xml:space="preserve">Filtrar por Clique na Barra</w:t>
+            </w:r>
+          </w:p>
+        </w:tc>
+        <w:tc>
+          <w:tcPr>
+            <w:tcW w:type="dxa" w:w="1504"/>
+            <w:shd w:fill="FFFFFF" w:color="auto" w:val="clear"/>
+          </w:tcPr>
+          <w:p>
+            <w:r>
+              <w:rPr>
+                <w:sz w:val="18"/>
+                <w:szCs w:val="18"/>
+              </w:rPr>
+              <w:t xml:space="preserve">Aplica um filtro local à lista da mesma tela ao clicar numa barra ou segmento</w:t>
+            </w:r>
+          </w:p>
+        </w:tc>
+        <w:tc>
+          <w:tcPr>
+            <w:tcW w:type="dxa" w:w="1504"/>
+            <w:shd w:fill="FFFFFF" w:color="auto" w:val="clear"/>
+          </w:tcPr>
+          <w:p>
+            <w:r>
+              <w:rPr>
+                <w:sz w:val="18"/>
+                <w:szCs w:val="18"/>
+              </w:rPr>
+              <w:t xml:space="preserve">Interação</w:t>
+            </w:r>
+          </w:p>
+        </w:tc>
+        <w:tc>
+          <w:tcPr>
+            <w:tcW w:type="dxa" w:w="1504"/>
+            <w:shd w:fill="FFFFFF" w:color="auto" w:val="clear"/>
+          </w:tcPr>
+          <w:p>
+            <w:r>
+              <w:rPr>
+                <w:sz w:val="18"/>
+                <w:szCs w:val="18"/>
+              </w:rPr>
+              <w:t xml:space="preserve">Gráfico com dados carregados</w:t>
+            </w:r>
+          </w:p>
+        </w:tc>
+        <w:tc>
+          <w:tcPr>
+            <w:tcW w:type="dxa" w:w="1504"/>
+            <w:shd w:fill="FFFFFF" w:color="auto" w:val="clear"/>
+          </w:tcPr>
+          <w:p>
+            <w:r>
+              <w:rPr>
+                <w:sz w:val="18"/>
+                <w:szCs w:val="18"/>
+              </w:rPr>
+              <w:t xml:space="preserve">Filtro é limpo clicando de novo na mesma barra ou no botão "✕"</w:t>
+            </w:r>
+          </w:p>
+        </w:tc>
+      </w:tr>
+    </w:tbl>
+    <w:p>
+      <w:pPr>
+        <w:spacing w:after="160"/>
+      </w:pPr>
+    </w:p>
+    <w:p>
+      <w:pPr>
+        <w:spacing w:after="160"/>
+      </w:pPr>
+      <w:r>
+        <w:rPr>
+          <w:b/>
+          <w:bCs/>
+        </w:rPr>
+        <w:t xml:space="preserve">Cenário</w:t>
+      </w:r>
+    </w:p>
+    <w:p>
+      <w:pPr>
+        <w:spacing w:after="160"/>
+      </w:pPr>
+      <w:r>
+        <w:t xml:space="preserve">O usuário abre Setores, Animais ou Insumos e vê, no topo da tela, um resumo visual dos dados já cadastrados: quantos animais de cada lote ocupam cada setor, quantos animais existem de cada raça, e quantos produtos existem em cada grupo (exceto Animais, já coberto pelo gráfico de raças). Ao clicar numa barra ou segmento, a lista abaixo é filtrada para mostrar apenas os itens daquela categoria, sem precisar digitar na busca.</w:t>
+      </w:r>
+    </w:p>
+    <w:p>
+      <w:pPr>
+        <w:spacing w:after="160"/>
+      </w:pPr>
+      <w:r>
+        <w:rPr>
+          <w:b/>
+          <w:bCs/>
+        </w:rPr>
+        <w:t xml:space="preserve">Pré-condições</w:t>
+      </w:r>
+    </w:p>
+    <w:p>
+      <w:pPr>
+        <w:spacing w:after="160"/>
+      </w:pPr>
+      <w:r>
+        <w:t xml:space="preserve">O usuário deve estar autenticado; a tela correspondente (Setores, Animais ou Insumos) deve ter pelo menos um registro para exibir algo além de um gráfico vazio.</w:t>
+      </w:r>
+    </w:p>
+    <w:p>
+      <w:pPr>
+        <w:spacing w:after="160"/>
+      </w:pPr>
+      <w:r>
+        <w:rPr>
+          <w:b/>
+          <w:bCs/>
+        </w:rPr>
+        <w:t xml:space="preserve">Fluxo Principal</w:t>
+      </w:r>
+    </w:p>
+    <w:p>
+      <w:pPr>
+        <w:pStyle w:val="ListParagraph"/>
+        <w:numPr>
+          <w:ilvl w:val="0"/>
+          <w:numId w:val="2"/>
+        </w:numPr>
+        <w:spacing w:after="80"/>
+      </w:pPr>
+      <w:r>
+        <w:t xml:space="preserve">O usuário abre a tela de Setores, Animais ou Insumos.</w:t>
+      </w:r>
+    </w:p>
+    <w:p>
+      <w:pPr>
+        <w:pStyle w:val="ListParagraph"/>
+        <w:numPr>
+          <w:ilvl w:val="0"/>
+          <w:numId w:val="2"/>
+        </w:numPr>
+        <w:spacing w:after="80"/>
+      </w:pPr>
+      <w:r>
+        <w:t xml:space="preserve">O sistema calcula a distribuição (ocupação por setor, animais por raça, ou produtos por grupo) a partir dos dados já carregados para a listagem da própria tela, sem nenhuma chamada adicional à API.</w:t>
+      </w:r>
+    </w:p>
+    <w:p>
+      <w:pPr>
+        <w:pStyle w:val="ListParagraph"/>
+        <w:numPr>
+          <w:ilvl w:val="0"/>
+          <w:numId w:val="2"/>
+        </w:numPr>
+        <w:spacing w:after="80"/>
+      </w:pPr>
+      <w:r>
+        <w:t xml:space="preserve">O sistema atribui uma cor estável a cada categoria (lote, raça ou grupo) com base no nome/id, reaproveitando a mesma paleta de 8 tons nas três telas.</w:t>
+      </w:r>
+    </w:p>
+    <w:p>
+      <w:pPr>
+        <w:pStyle w:val="ListParagraph"/>
+        <w:numPr>
+          <w:ilvl w:val="0"/>
+          <w:numId w:val="2"/>
+        </w:numPr>
+        <w:spacing w:after="80"/>
+      </w:pPr>
+      <w:r>
+        <w:t xml:space="preserve">O usuário clica numa barra (ou num segmento, no caso de Setores) para filtrar a lista abaixo por aquela categoria.</w:t>
+      </w:r>
+    </w:p>
+    <w:p>
+      <w:pPr>
+        <w:pStyle w:val="ListParagraph"/>
+        <w:numPr>
+          <w:ilvl w:val="0"/>
+          <w:numId w:val="2"/>
+        </w:numPr>
+        <w:spacing w:after="80"/>
+      </w:pPr>
+      <w:r>
+        <w:t xml:space="preserve">O usuário clica de novo na mesma barra, ou no botão "✕" do indicador de filtro, para voltar a ver a lista completa.</w:t>
+      </w:r>
+    </w:p>
+    <w:p>
+      <w:pPr>
+        <w:spacing w:after="160"/>
+      </w:pPr>
+      <w:r>
+        <w:rPr>
+          <w:b/>
+          <w:bCs/>
+        </w:rPr>
+        <w:t xml:space="preserve">Subfluxo</w:t>
+      </w:r>
+    </w:p>
+    <w:p>
+      <w:pPr>
+        <w:pStyle w:val="ListParagraph"/>
+        <w:numPr>
+          <w:ilvl w:val="0"/>
+          <w:numId w:val="1"/>
+        </w:numPr>
+        <w:spacing w:after="80"/>
+      </w:pPr>
+      <w:r>
+        <w:rPr>
+          <w:b/>
+          <w:bCs/>
+        </w:rPr>
+        <w:t xml:space="preserve">SF01: Mais de 8 categorias simultâneas no mesmo gráfico — Duas categorias podem coincidir na mesma cor (a paleta tem 8 tons fixos); o rótulo direto ao lado de cada barra continua garantindo a identificação, mesmo com a cor repetida.</w:t>
+      </w:r>
+    </w:p>
+    <w:p>
+      <w:pPr>
+        <w:pStyle w:val="ListParagraph"/>
+        <w:numPr>
+          <w:ilvl w:val="0"/>
+          <w:numId w:val="1"/>
+        </w:numPr>
+        <w:spacing w:after="80"/>
+      </w:pPr>
+      <w:r>
+        <w:rPr>
+          <w:b/>
+          <w:bCs/>
+        </w:rPr>
+        <w:t xml:space="preserve">SF02: Setor sem capacidade máxima cadastrada (0) — A barra trata a ocupação atual como o próprio limite, sem erro de divisão por zero.</w:t>
+      </w:r>
+    </w:p>
+    <w:p>
+      <w:pPr>
+        <w:pStyle w:val="ListParagraph"/>
+        <w:numPr>
+          <w:ilvl w:val="0"/>
+          <w:numId w:val="1"/>
+        </w:numPr>
+        <w:spacing w:after="80"/>
+      </w:pPr>
+      <w:r>
+        <w:rPr>
+          <w:b/>
+          <w:bCs/>
+        </w:rPr>
+        <w:t xml:space="preserve">SF03: Nenhum lote alocado a um setor — A barra é exibida inteiramente neutra, sem segmentos coloridos.</w:t>
+      </w:r>
+    </w:p>
+    <w:p>
+      <w:pPr>
+        <w:pStyle w:val="ListParagraph"/>
+        <w:numPr>
+          <w:ilvl w:val="0"/>
+          <w:numId w:val="1"/>
+        </w:numPr>
+        <w:spacing w:after="80"/>
+      </w:pPr>
+      <w:r>
+        <w:rPr>
+          <w:b/>
+          <w:bCs/>
+        </w:rPr>
+        <w:t xml:space="preserve">SF04: Lote inativado (excluído) ainda alocado a um setor — A alocação é ignorada na ocupação exibida (ver correção em SSetor.toDto).</w:t>
+      </w:r>
+    </w:p>
+    <w:p>
+      <w:r>
+        <w:br w:type="page"/>
+      </w:r>
+    </w:p>
+    <w:p>
+      <w:pPr>
         <w:pStyle w:val="Heading1"/>
         <w:spacing w:after="200" w:before="360"/>
       </w:pPr>
@@ -34621,67 +38395,7 @@
         <w:spacing w:after="160"/>
       </w:pPr>
       <w:r>
-        <w:t xml:space="preserve">Colunas: </w:t>
-      </w:r>
-      <w:r>
-        <w:rPr>
-          <w:rFonts w:ascii="Consolas" w:cs="Consolas" w:eastAsia="Consolas" w:hAnsi="Consolas"/>
-        </w:rPr>
-        <w:t xml:space="preserve">codigo_brinco</w:t>
-      </w:r>
-      <w:r>
-        <w:t xml:space="preserve"> (único, gerado automaticamente), </w:t>
-      </w:r>
-      <w:r>
-        <w:rPr>
-          <w:rFonts w:ascii="Consolas" w:cs="Consolas" w:eastAsia="Consolas" w:hAnsi="Consolas"/>
-        </w:rPr>
-        <w:t xml:space="preserve">data_nascimento</w:t>
-      </w:r>
-      <w:r>
-        <w:t xml:space="preserve">, </w:t>
-      </w:r>
-      <w:r>
-        <w:rPr>
-          <w:rFonts w:ascii="Consolas" w:cs="Consolas" w:eastAsia="Consolas" w:hAnsi="Consolas"/>
-        </w:rPr>
-        <w:t xml:space="preserve">peso_atual</w:t>
-      </w:r>
-      <w:r>
-        <w:t xml:space="preserve">, </w:t>
-      </w:r>
-      <w:r>
-        <w:rPr>
-          <w:rFonts w:ascii="Consolas" w:cs="Consolas" w:eastAsia="Consolas" w:hAnsi="Consolas"/>
-        </w:rPr>
-        <w:t xml:space="preserve">cor</w:t>
-      </w:r>
-      <w:r>
-        <w:t xml:space="preserve">, </w:t>
-      </w:r>
-      <w:r>
-        <w:rPr>
-          <w:rFonts w:ascii="Consolas" w:cs="Consolas" w:eastAsia="Consolas" w:hAnsi="Consolas"/>
-        </w:rPr>
-        <w:t xml:space="preserve">altura_cernelha</w:t>
-      </w:r>
-      <w:r>
-        <w:t xml:space="preserve">, </w:t>
-      </w:r>
-      <w:r>
-        <w:rPr>
-          <w:rFonts w:ascii="Consolas" w:cs="Consolas" w:eastAsia="Consolas" w:hAnsi="Consolas"/>
-        </w:rPr>
-        <w:t xml:space="preserve">perimetro_toracico</w:t>
-      </w:r>
-      <w:r>
-        <w:t xml:space="preserve">, </w:t>
-      </w:r>
-      <w:r>
-        <w:rPr>
-          <w:rFonts w:ascii="Consolas" w:cs="Consolas" w:eastAsia="Consolas" w:hAnsi="Consolas"/>
-        </w:rPr>
-        <w:t xml:space="preserve">comprimento_corporal</w:t>
+        <w:t xml:space="preserve">Colunas: codigo_brinco (único, gerado automaticamente), data_nascimento, peso_atual, cor, altura_cernelha, perimetro_toracico, comprimento_corporal, valor_aquisicao, data_aquisicao</w:t>
       </w:r>
     </w:p>
     <w:p>
@@ -34694,6 +38408,62 @@
           <w:iCs/>
         </w:rPr>
         <w:t xml:space="preserve">(Removidas em relação à v2.0/schema inicial: `nome` e `raca` em texto livre.)</w:t>
+      </w:r>
+    </w:p>
+    <w:p>
+      <w:pPr>
+        <w:spacing w:after="160"/>
+      </w:pPr>
+      <w:r>
+        <w:rPr>
+          <w:b/>
+          <w:bCs/>
+        </w:rPr>
+        <w:t xml:space="preserve">Tabela: `custo_animal` (não existia na v2.1 — nova, feature de Custo de Vida do Animal)</w:t>
+      </w:r>
+    </w:p>
+    <w:p>
+      <w:pPr>
+        <w:spacing w:after="160"/>
+      </w:pPr>
+      <w:r>
+        <w:t xml:space="preserve">PK: id — FK: animal_id → animal(id)</w:t>
+      </w:r>
+    </w:p>
+    <w:p>
+      <w:pPr>
+        <w:spacing w:after="160"/>
+      </w:pPr>
+      <w:r>
+        <w:t xml:space="preserve">ENUM tipo_custo: AQUISICAO, ALIMENTACAO, VACINACAO</w:t>
+      </w:r>
+    </w:p>
+    <w:p>
+      <w:pPr>
+        <w:spacing w:after="160"/>
+      </w:pPr>
+      <w:r>
+        <w:t xml:space="preserve">Colunas: valor, quantidade, data_evento, origem_tipo, origem_id, descricao, registrado_por_email</w:t>
+      </w:r>
+    </w:p>
+    <w:p>
+      <w:pPr>
+        <w:spacing w:after="160"/>
+      </w:pPr>
+      <w:r>
+        <w:t xml:space="preserve">Índices: (origem_tipo, origem_id) para permitir estorno/recálculo idempotente quando a origem é editada ou cancelada; animal_id para consultar o histórico de um animal.</w:t>
+      </w:r>
+    </w:p>
+    <w:p>
+      <w:pPr>
+        <w:spacing w:after="160"/>
+      </w:pPr>
+      <w:r>
+        <w:rPr>
+          <w:i/>
+          <w:iCs/>
+        </w:rPr>
+        <w:t xml:space="preserve">(origem_tipo identifica o registro de origem do lançamento: consumo_insumo, vacinacao_animal_item ou o próprio animal, no caso de aquisição.)</w:t>
       </w:r>
     </w:p>
     <w:p>

</xml_diff>

<commit_message>
docs: atualiza PRAXIS com parceiro/pagamento nas NFs e aba Rentabilidade
Documenta no UC12 os novos campos de forma de pagamento, vencimento e
parcelas, e reescreve o UC17 (Dashboard -> Rentabilidade) com o filtro
de periodo, as tres novas secoes (contas por parceiro, produtos mais
vendidos, maiores gastos por grupo) e a exportacao em CSV/PDF.

Co-Authored-By: Claude Sonnet 5 <noreply@anthropic.com>
</commit_message>
<xml_diff>
--- a/Arquivos Projeto/PRAXIS (v.2.1 - Atualizado).docx
+++ b/Arquivos Projeto/PRAXIS (v.2.1 - Atualizado).docx
@@ -20070,6 +20070,24 @@
           <w:b/>
           <w:bCs/>
         </w:rPr>
+        <w:t xml:space="preserve">Mudança relevante em relação à v2.1: </w:t>
+      </w:r>
+      <w:r>
+        <w:rPr>
+          <w:b w:val="0"/>
+        </w:rPr>
+        <w:t>a listagem passou a exibir o nome do parceiro (fornecedor, nos documentos de entrada) de cada documento. Documentos de entrada e de saída ganharam forma de pagamento (à vista ou parcelado), data de vencimento, número de parcelas e valor de cada parcela — extraídos automaticamente do XML (tags &lt;cobr&gt;/&lt;dup&gt;) quando a NF-e já traz a condição de pagamento, ou informados manualmente no cadastro de recibos e vendas quando ausente no XML. Esses dados alimentam o resumo de Contas a Pagar e Receber por Parceiro da aba Rentabilidade (ver UC17).</w:t>
+      </w:r>
+    </w:p>
+    <w:p>
+      <w:pPr>
+        <w:spacing w:after="160"/>
+      </w:pPr>
+      <w:r>
+        <w:rPr>
+          <w:b/>
+          <w:bCs/>
+        </w:rPr>
         <w:t xml:space="preserve">Campos</w:t>
       </w:r>
     </w:p>
@@ -21012,6 +21030,243 @@
           </w:p>
         </w:tc>
       </w:tr>
+      <w:tr>
+        <w:tc>
+          <w:tcPr>
+            <w:tcW w:type="dxa" w:w="100"/>
+            <w:shd w:val="clear" w:color="auto" w:fill="FFFFFF"/>
+          </w:tcPr>
+          <w:p>
+            <w:r>
+              <w:t>8</w:t>
+            </w:r>
+          </w:p>
+        </w:tc>
+        <w:tc>
+          <w:tcPr>
+            <w:tcW w:type="dxa" w:w="100"/>
+            <w:shd w:val="clear" w:color="auto" w:fill="FFFFFF"/>
+          </w:tcPr>
+          <w:p>
+            <w:r>
+              <w:t>Forma de Pagamento</w:t>
+            </w:r>
+          </w:p>
+        </w:tc>
+        <w:tc>
+          <w:tcPr>
+            <w:tcW w:type="dxa" w:w="100"/>
+            <w:shd w:val="clear" w:color="auto" w:fill="FFFFFF"/>
+          </w:tcPr>
+          <w:p>
+            <w:r>
+              <w:t>Indica se o documento é à vista ou parcelado</w:t>
+            </w:r>
+          </w:p>
+        </w:tc>
+        <w:tc>
+          <w:tcPr>
+            <w:tcW w:type="dxa" w:w="100"/>
+            <w:shd w:val="clear" w:color="auto" w:fill="FFFFFF"/>
+          </w:tcPr>
+          <w:p>
+            <w:r>
+              <w:t>Dados do documento</w:t>
+            </w:r>
+          </w:p>
+        </w:tc>
+        <w:tc>
+          <w:tcPr>
+            <w:tcW w:type="dxa" w:w="100"/>
+            <w:shd w:val="clear" w:color="auto" w:fill="FFFFFF"/>
+          </w:tcPr>
+          <w:p>
+            <w:r>
+              <w:t>À Vista ou Parcelado</w:t>
+            </w:r>
+          </w:p>
+        </w:tc>
+        <w:tc>
+          <w:tcPr>
+            <w:tcW w:type="dxa" w:w="100"/>
+            <w:shd w:val="clear" w:color="auto" w:fill="FFFFFF"/>
+          </w:tcPr>
+          <w:p>
+            <w:r>
+              <w:t>Extraída do XML (&lt;cobr&gt;/&lt;dup&gt;) ou informada manualmente</w:t>
+            </w:r>
+          </w:p>
+        </w:tc>
+        <w:tc>
+          <w:tcPr>
+            <w:tcW w:type="dxa" w:w="100"/>
+            <w:shd w:val="clear" w:color="auto" w:fill="FFFFFF"/>
+          </w:tcPr>
+          <w:p>
+            <w:r>
+              <w:t>Padrão: À Vista, com vencimento na data de emissão</w:t>
+            </w:r>
+          </w:p>
+        </w:tc>
+      </w:tr>
+      <w:tr>
+        <w:tc>
+          <w:tcPr>
+            <w:tcW w:type="dxa" w:w="100"/>
+            <w:shd w:val="clear" w:color="auto" w:fill="F2F5F0"/>
+          </w:tcPr>
+          <w:p>
+            <w:r>
+              <w:t>9</w:t>
+            </w:r>
+          </w:p>
+        </w:tc>
+        <w:tc>
+          <w:tcPr>
+            <w:tcW w:type="dxa" w:w="100"/>
+            <w:shd w:val="clear" w:color="auto" w:fill="F2F5F0"/>
+          </w:tcPr>
+          <w:p>
+            <w:r>
+              <w:t>Data de Vencimento</w:t>
+            </w:r>
+          </w:p>
+        </w:tc>
+        <w:tc>
+          <w:tcPr>
+            <w:tcW w:type="dxa" w:w="100"/>
+            <w:shd w:val="clear" w:color="auto" w:fill="F2F5F0"/>
+          </w:tcPr>
+          <w:p>
+            <w:r>
+              <w:t>Vencimento único (à vista) ou da primeira parcela</w:t>
+            </w:r>
+          </w:p>
+        </w:tc>
+        <w:tc>
+          <w:tcPr>
+            <w:tcW w:type="dxa" w:w="100"/>
+            <w:shd w:val="clear" w:color="auto" w:fill="F2F5F0"/>
+          </w:tcPr>
+          <w:p>
+            <w:r>
+              <w:t>Dados do documento</w:t>
+            </w:r>
+          </w:p>
+        </w:tc>
+        <w:tc>
+          <w:tcPr>
+            <w:tcW w:type="dxa" w:w="100"/>
+            <w:shd w:val="clear" w:color="auto" w:fill="F2F5F0"/>
+          </w:tcPr>
+          <w:p>
+            <w:r>
+              <w:t>Data válida</w:t>
+            </w:r>
+          </w:p>
+        </w:tc>
+        <w:tc>
+          <w:tcPr>
+            <w:tcW w:type="dxa" w:w="100"/>
+            <w:shd w:val="clear" w:color="auto" w:fill="F2F5F0"/>
+          </w:tcPr>
+          <w:p>
+            <w:r>
+              <w:t>Extraída do XML ou informada manualmente</w:t>
+            </w:r>
+          </w:p>
+        </w:tc>
+        <w:tc>
+          <w:tcPr>
+            <w:tcW w:type="dxa" w:w="100"/>
+            <w:shd w:val="clear" w:color="auto" w:fill="F2F5F0"/>
+          </w:tcPr>
+          <w:p>
+            <w:r>
+              <w:t>Vencimentos das parcelas seguintes calculados a +1 mês cada, não persistidos individualmente</w:t>
+            </w:r>
+          </w:p>
+        </w:tc>
+      </w:tr>
+      <w:tr>
+        <w:tc>
+          <w:tcPr>
+            <w:tcW w:type="dxa" w:w="100"/>
+            <w:shd w:val="clear" w:color="auto" w:fill="FFFFFF"/>
+          </w:tcPr>
+          <w:p>
+            <w:r>
+              <w:t>10</w:t>
+            </w:r>
+          </w:p>
+        </w:tc>
+        <w:tc>
+          <w:tcPr>
+            <w:tcW w:type="dxa" w:w="100"/>
+            <w:shd w:val="clear" w:color="auto" w:fill="FFFFFF"/>
+          </w:tcPr>
+          <w:p>
+            <w:r>
+              <w:t>Número de Parcelas / Valor da Parcela</w:t>
+            </w:r>
+          </w:p>
+        </w:tc>
+        <w:tc>
+          <w:tcPr>
+            <w:tcW w:type="dxa" w:w="100"/>
+            <w:shd w:val="clear" w:color="auto" w:fill="FFFFFF"/>
+          </w:tcPr>
+          <w:p>
+            <w:r>
+              <w:t>Quantidade de parcelas e valor de cada uma, quando parcelado</w:t>
+            </w:r>
+          </w:p>
+        </w:tc>
+        <w:tc>
+          <w:tcPr>
+            <w:tcW w:type="dxa" w:w="100"/>
+            <w:shd w:val="clear" w:color="auto" w:fill="FFFFFF"/>
+          </w:tcPr>
+          <w:p>
+            <w:r>
+              <w:t>Dados do documento</w:t>
+            </w:r>
+          </w:p>
+        </w:tc>
+        <w:tc>
+          <w:tcPr>
+            <w:tcW w:type="dxa" w:w="100"/>
+            <w:shd w:val="clear" w:color="auto" w:fill="FFFFFF"/>
+          </w:tcPr>
+          <w:p>
+            <w:r>
+              <w:t>Número inteiro ≥ 2 e valor decimal</w:t>
+            </w:r>
+          </w:p>
+        </w:tc>
+        <w:tc>
+          <w:tcPr>
+            <w:tcW w:type="dxa" w:w="100"/>
+            <w:shd w:val="clear" w:color="auto" w:fill="FFFFFF"/>
+          </w:tcPr>
+          <w:p>
+            <w:r>
+              <w:t>Obrigatórios apenas quando Forma de Pagamento = Parcelado</w:t>
+            </w:r>
+          </w:p>
+        </w:tc>
+        <w:tc>
+          <w:tcPr>
+            <w:tcW w:type="dxa" w:w="100"/>
+            <w:shd w:val="clear" w:color="auto" w:fill="FFFFFF"/>
+          </w:tcPr>
+          <w:p>
+            <w:r>
+              <w:t>—</w:t>
+            </w:r>
+          </w:p>
+        </w:tc>
+      </w:tr>
     </w:tbl>
     <w:p>
       <w:pPr>
@@ -28723,7 +28978,7 @@
         <w:spacing w:after="160" w:before="280"/>
       </w:pPr>
       <w:r>
-        <w:t xml:space="preserve">Especificação do caso de uso UC17: Financeiro — Dashboard (DRE)</w:t>
+        <w:t>Especificação do caso de uso UC17: Financeiro — Rentabilidade</w:t>
       </w:r>
     </w:p>
     <w:p>
@@ -28747,7 +29002,7 @@
           <w:b/>
           <w:bCs/>
         </w:rPr>
-        <w:t xml:space="preserve">Interface de Usuário: Financeiro → Dashboard</w:t>
+        <w:t>Interface de Usuário: Financeiro → Rentabilidade</w:t>
       </w:r>
     </w:p>
     <w:p>
@@ -28771,7 +29026,7 @@
           <w:i/>
           <w:iCs/>
         </w:rPr>
-        <w:t xml:space="preserve">(placeholder de layout — inclui gráfico de linha do DRE mensal)</w:t>
+        <w:t>(placeholder de layout — inclui filtro de período, gráfico de linha do DRE mensal, contas a pagar/receber por parceiro, produtos mais vendidos e maiores gastos por grupo)</w:t>
       </w:r>
     </w:p>
     <w:p>
@@ -28801,6 +29056,24 @@
       </w:r>
       <w:r>
         <w:t xml:space="preserve">), alimentado automaticamente por Documentos de Entrada, Folha de Pagamento, Consumo de Estoque, Vendas e por lançamentos Manuais ou de Perda de Alimentação.</w:t>
+      </w:r>
+    </w:p>
+    <w:p>
+      <w:pPr>
+        <w:spacing w:after="160"/>
+      </w:pPr>
+      <w:r>
+        <w:rPr>
+          <w:b/>
+        </w:rPr>
+        <w:t xml:space="preserve">Mudança relevante em relação à v2.1: </w:t>
+      </w:r>
+      <w:r>
+        <w:rPr>
+          <w:rFonts w:ascii="Consolas" w:cs="Consolas" w:eastAsia="Consolas" w:hAnsi="Consolas"/>
+          <w:b w:val="0"/>
+        </w:rPr>
+        <w:t>a aba foi renomeada de Dashboard para Rentabilidade e passou a ter um filtro de período (data de início e data de fim) no lugar do seletor fixo de mês/ano — o mesmo período filtra tanto a tela quanto o relatório exportado. Três novas seções foram adicionadas: Contas a Pagar e Receber por Parceiro (gráfico de barras e lista resumida por parceiro, considerando a data de vencimento de cada NF — ver UC12); Produtos Mais Vendidos (vendas por raça de animal e litros de leite vendidos no período, em ordem decrescente de valor); e Maiores Gastos por Grupo (saídas do período agrupadas por grupo de produto, com a Folha de Pagamento — UC16 — aparecendo como um grupo próprio). Um botão de exportação gera um CSV com as contas por parceiro ou um PDF com as três seções, respeitando o período selecionado.</w:t>
       </w:r>
     </w:p>
     <w:p>
@@ -29069,7 +29342,7 @@
                 <w:sz w:val="18"/>
                 <w:szCs w:val="18"/>
               </w:rPr>
-              <w:t xml:space="preserve">Filtro por mês/ano de competência</w:t>
+              <w:t>Filtro pelo período (data de início e data de fim) selecionado</w:t>
             </w:r>
           </w:p>
         </w:tc>
@@ -29101,22 +29374,22 @@
                 <w:sz w:val="18"/>
                 <w:szCs w:val="18"/>
               </w:rPr>
-              <w:t xml:space="preserve">Resumo Mensal (DRE)</w:t>
-            </w:r>
-          </w:p>
-        </w:tc>
-        <w:tc>
-          <w:tcPr>
-            <w:tcW w:type="dxa" w:w="1289"/>
-            <w:shd w:fill="FFFFFF" w:color="auto" w:val="clear"/>
-          </w:tcPr>
-          <w:p>
-            <w:r>
-              <w:rPr>
-                <w:sz w:val="18"/>
-                <w:szCs w:val="18"/>
-              </w:rPr>
-              <w:t xml:space="preserve">Totais de entrada, saída e resultado do mês</w:t>
+              <w:t>Resumo do Período (DRE)</w:t>
+            </w:r>
+          </w:p>
+        </w:tc>
+        <w:tc>
+          <w:tcPr>
+            <w:tcW w:type="dxa" w:w="1289"/>
+            <w:shd w:fill="FFFFFF" w:color="auto" w:val="clear"/>
+          </w:tcPr>
+          <w:p>
+            <w:r>
+              <w:rPr>
+                <w:sz w:val="18"/>
+                <w:szCs w:val="18"/>
+              </w:rPr>
+              <w:t>Totais de entrada, saída e resultado do período selecionado</w:t>
             </w:r>
           </w:p>
         </w:tc>
@@ -29177,7 +29450,7 @@
                 <w:sz w:val="18"/>
                 <w:szCs w:val="18"/>
               </w:rPr>
-              <w:t xml:space="preserve">GET /api/financeiro/lancamentos/resumo-mensal</w:t>
+              <w:t>GET /api/financeiro/rentabilidade/resumo</w:t>
             </w:r>
           </w:p>
         </w:tc>
@@ -29285,6 +29558,322 @@
                 <w:szCs w:val="18"/>
               </w:rPr>
               <w:t xml:space="preserve">Lançamentos com origem PERDA_ALIMENTACAO não existiam na v2.0</w:t>
+            </w:r>
+          </w:p>
+        </w:tc>
+      </w:tr>
+      <w:tr>
+        <w:tc>
+          <w:tcPr>
+            <w:tcW w:type="dxa" w:w="100"/>
+            <w:shd w:val="clear" w:color="auto" w:fill="FFFFFF"/>
+          </w:tcPr>
+          <w:p>
+            <w:r>
+              <w:t>4</w:t>
+            </w:r>
+          </w:p>
+        </w:tc>
+        <w:tc>
+          <w:tcPr>
+            <w:tcW w:type="dxa" w:w="100"/>
+            <w:shd w:val="clear" w:color="auto" w:fill="FFFFFF"/>
+          </w:tcPr>
+          <w:p>
+            <w:r>
+              <w:t>Filtro de Período</w:t>
+            </w:r>
+          </w:p>
+        </w:tc>
+        <w:tc>
+          <w:tcPr>
+            <w:tcW w:type="dxa" w:w="100"/>
+            <w:shd w:val="clear" w:color="auto" w:fill="FFFFFF"/>
+          </w:tcPr>
+          <w:p>
+            <w:r>
+              <w:t>Data de início e data de fim que delimitam todos os dados da aba</w:t>
+            </w:r>
+          </w:p>
+        </w:tc>
+        <w:tc>
+          <w:tcPr>
+            <w:tcW w:type="dxa" w:w="100"/>
+            <w:shd w:val="clear" w:color="auto" w:fill="FFFFFF"/>
+          </w:tcPr>
+          <w:p>
+            <w:r>
+              <w:t>Filtro</w:t>
+            </w:r>
+          </w:p>
+        </w:tc>
+        <w:tc>
+          <w:tcPr>
+            <w:tcW w:type="dxa" w:w="100"/>
+            <w:shd w:val="clear" w:color="auto" w:fill="FFFFFF"/>
+          </w:tcPr>
+          <w:p>
+            <w:r>
+              <w:t>Duas datas válidas, início ≤ fim</w:t>
+            </w:r>
+          </w:p>
+        </w:tc>
+        <w:tc>
+          <w:tcPr>
+            <w:tcW w:type="dxa" w:w="100"/>
+            <w:shd w:val="clear" w:color="auto" w:fill="FFFFFF"/>
+          </w:tcPr>
+          <w:p>
+            <w:r>
+              <w:t>Editável</w:t>
+            </w:r>
+          </w:p>
+        </w:tc>
+        <w:tc>
+          <w:tcPr>
+            <w:tcW w:type="dxa" w:w="100"/>
+            <w:shd w:val="clear" w:color="auto" w:fill="FFFFFF"/>
+          </w:tcPr>
+          <w:p>
+            <w:r>
+              <w:t>Reflete também no relatório exportado (CSV/PDF)</w:t>
+            </w:r>
+          </w:p>
+        </w:tc>
+      </w:tr>
+      <w:tr>
+        <w:tc>
+          <w:tcPr>
+            <w:tcW w:type="dxa" w:w="100"/>
+            <w:shd w:val="clear" w:color="auto" w:fill="F2F5F0"/>
+          </w:tcPr>
+          <w:p>
+            <w:r>
+              <w:t>5</w:t>
+            </w:r>
+          </w:p>
+        </w:tc>
+        <w:tc>
+          <w:tcPr>
+            <w:tcW w:type="dxa" w:w="100"/>
+            <w:shd w:val="clear" w:color="auto" w:fill="F2F5F0"/>
+          </w:tcPr>
+          <w:p>
+            <w:r>
+              <w:t>Contas a Pagar e Receber por Parceiro</w:t>
+            </w:r>
+          </w:p>
+        </w:tc>
+        <w:tc>
+          <w:tcPr>
+            <w:tcW w:type="dxa" w:w="100"/>
+            <w:shd w:val="clear" w:color="auto" w:fill="F2F5F0"/>
+          </w:tcPr>
+          <w:p>
+            <w:r>
+              <w:t>Lista resumida por parceiro: total a pagar, total a receber, quantidade de NFs e próximo vencimento, no período</w:t>
+            </w:r>
+          </w:p>
+        </w:tc>
+        <w:tc>
+          <w:tcPr>
+            <w:tcW w:type="dxa" w:w="100"/>
+            <w:shd w:val="clear" w:color="auto" w:fill="F2F5F0"/>
+          </w:tcPr>
+          <w:p>
+            <w:r>
+              <w:t>Resultado da consulta</w:t>
+            </w:r>
+          </w:p>
+        </w:tc>
+        <w:tc>
+          <w:tcPr>
+            <w:tcW w:type="dxa" w:w="100"/>
+            <w:shd w:val="clear" w:color="auto" w:fill="F2F5F0"/>
+          </w:tcPr>
+          <w:p>
+            <w:r>
+              <w:t>—</w:t>
+            </w:r>
+          </w:p>
+        </w:tc>
+        <w:tc>
+          <w:tcPr>
+            <w:tcW w:type="dxa" w:w="100"/>
+            <w:shd w:val="clear" w:color="auto" w:fill="F2F5F0"/>
+          </w:tcPr>
+          <w:p>
+            <w:r>
+              <w:t>Não editável</w:t>
+            </w:r>
+          </w:p>
+        </w:tc>
+        <w:tc>
+          <w:tcPr>
+            <w:tcW w:type="dxa" w:w="100"/>
+            <w:shd w:val="clear" w:color="auto" w:fill="F2F5F0"/>
+          </w:tcPr>
+          <w:p>
+            <w:r>
+              <w:t>GET /api/financeiro/rentabilidade/contas-parceiro</w:t>
+            </w:r>
+          </w:p>
+        </w:tc>
+      </w:tr>
+      <w:tr>
+        <w:tc>
+          <w:tcPr>
+            <w:tcW w:type="dxa" w:w="100"/>
+            <w:shd w:val="clear" w:color="auto" w:fill="FFFFFF"/>
+          </w:tcPr>
+          <w:p>
+            <w:r>
+              <w:t>6</w:t>
+            </w:r>
+          </w:p>
+        </w:tc>
+        <w:tc>
+          <w:tcPr>
+            <w:tcW w:type="dxa" w:w="100"/>
+            <w:shd w:val="clear" w:color="auto" w:fill="FFFFFF"/>
+          </w:tcPr>
+          <w:p>
+            <w:r>
+              <w:t>Produtos Mais Vendidos</w:t>
+            </w:r>
+          </w:p>
+        </w:tc>
+        <w:tc>
+          <w:tcPr>
+            <w:tcW w:type="dxa" w:w="100"/>
+            <w:shd w:val="clear" w:color="auto" w:fill="FFFFFF"/>
+          </w:tcPr>
+          <w:p>
+            <w:r>
+              <w:t>Vendas por raça de animal e litros de leite vendidos, em ordem decrescente de valor</w:t>
+            </w:r>
+          </w:p>
+        </w:tc>
+        <w:tc>
+          <w:tcPr>
+            <w:tcW w:type="dxa" w:w="100"/>
+            <w:shd w:val="clear" w:color="auto" w:fill="FFFFFF"/>
+          </w:tcPr>
+          <w:p>
+            <w:r>
+              <w:t>Resultado da consulta</w:t>
+            </w:r>
+          </w:p>
+        </w:tc>
+        <w:tc>
+          <w:tcPr>
+            <w:tcW w:type="dxa" w:w="100"/>
+            <w:shd w:val="clear" w:color="auto" w:fill="FFFFFF"/>
+          </w:tcPr>
+          <w:p>
+            <w:r>
+              <w:t>—</w:t>
+            </w:r>
+          </w:p>
+        </w:tc>
+        <w:tc>
+          <w:tcPr>
+            <w:tcW w:type="dxa" w:w="100"/>
+            <w:shd w:val="clear" w:color="auto" w:fill="FFFFFF"/>
+          </w:tcPr>
+          <w:p>
+            <w:r>
+              <w:t>Não editável</w:t>
+            </w:r>
+          </w:p>
+        </w:tc>
+        <w:tc>
+          <w:tcPr>
+            <w:tcW w:type="dxa" w:w="100"/>
+            <w:shd w:val="clear" w:color="auto" w:fill="FFFFFF"/>
+          </w:tcPr>
+          <w:p>
+            <w:r>
+              <w:t>GET /api/financeiro/rentabilidade/vendas-produto</w:t>
+            </w:r>
+          </w:p>
+        </w:tc>
+      </w:tr>
+      <w:tr>
+        <w:tc>
+          <w:tcPr>
+            <w:tcW w:type="dxa" w:w="100"/>
+            <w:shd w:val="clear" w:color="auto" w:fill="F2F5F0"/>
+          </w:tcPr>
+          <w:p>
+            <w:r>
+              <w:t>7</w:t>
+            </w:r>
+          </w:p>
+        </w:tc>
+        <w:tc>
+          <w:tcPr>
+            <w:tcW w:type="dxa" w:w="100"/>
+            <w:shd w:val="clear" w:color="auto" w:fill="F2F5F0"/>
+          </w:tcPr>
+          <w:p>
+            <w:r>
+              <w:t>Maiores Gastos por Grupo</w:t>
+            </w:r>
+          </w:p>
+        </w:tc>
+        <w:tc>
+          <w:tcPr>
+            <w:tcW w:type="dxa" w:w="100"/>
+            <w:shd w:val="clear" w:color="auto" w:fill="F2F5F0"/>
+          </w:tcPr>
+          <w:p>
+            <w:r>
+              <w:t>Saídas do período agrupadas por grupo de produto, Folha de Pagamento, Perda de Alimentação ou Lançamentos Manuais, em ordem decrescente</w:t>
+            </w:r>
+          </w:p>
+        </w:tc>
+        <w:tc>
+          <w:tcPr>
+            <w:tcW w:type="dxa" w:w="100"/>
+            <w:shd w:val="clear" w:color="auto" w:fill="F2F5F0"/>
+          </w:tcPr>
+          <w:p>
+            <w:r>
+              <w:t>Resultado da consulta</w:t>
+            </w:r>
+          </w:p>
+        </w:tc>
+        <w:tc>
+          <w:tcPr>
+            <w:tcW w:type="dxa" w:w="100"/>
+            <w:shd w:val="clear" w:color="auto" w:fill="F2F5F0"/>
+          </w:tcPr>
+          <w:p>
+            <w:r>
+              <w:t>—</w:t>
+            </w:r>
+          </w:p>
+        </w:tc>
+        <w:tc>
+          <w:tcPr>
+            <w:tcW w:type="dxa" w:w="100"/>
+            <w:shd w:val="clear" w:color="auto" w:fill="F2F5F0"/>
+          </w:tcPr>
+          <w:p>
+            <w:r>
+              <w:t>Não editável</w:t>
+            </w:r>
+          </w:p>
+        </w:tc>
+        <w:tc>
+          <w:tcPr>
+            <w:tcW w:type="dxa" w:w="100"/>
+            <w:shd w:val="clear" w:color="auto" w:fill="F2F5F0"/>
+          </w:tcPr>
+          <w:p>
+            <w:r>
+              <w:t>GET /api/financeiro/rentabilidade/gastos-grupo</w:t>
             </w:r>
           </w:p>
         </w:tc>
@@ -29574,7 +30163,7 @@
                 <w:sz w:val="18"/>
                 <w:szCs w:val="18"/>
               </w:rPr>
-              <w:t xml:space="preserve">Filtra os lançamentos por mês/ano de competência</w:t>
+              <w:t>Define a data de início e fim para todos os dados da aba</w:t>
             </w:r>
           </w:p>
         </w:tc>
@@ -29604,22 +30193,158 @@
                 <w:sz w:val="18"/>
                 <w:szCs w:val="18"/>
               </w:rPr>
-              <w:t xml:space="preserve">—</w:t>
-            </w:r>
-          </w:p>
-        </w:tc>
-        <w:tc>
-          <w:tcPr>
-            <w:tcW w:type="dxa" w:w="1504"/>
-            <w:shd w:fill="FFFFFF" w:color="auto" w:val="clear"/>
-          </w:tcPr>
-          <w:p>
-            <w:r>
-              <w:rPr>
-                <w:sz w:val="18"/>
-                <w:szCs w:val="18"/>
-              </w:rPr>
-              <w:t xml:space="preserve">—</w:t>
+              <w:t>Data de início ≤ data de fim</w:t>
+            </w:r>
+          </w:p>
+        </w:tc>
+        <w:tc>
+          <w:tcPr>
+            <w:tcW w:type="dxa" w:w="1504"/>
+            <w:shd w:fill="FFFFFF" w:color="auto" w:val="clear"/>
+          </w:tcPr>
+          <w:p>
+            <w:r>
+              <w:rPr>
+                <w:sz w:val="18"/>
+                <w:szCs w:val="18"/>
+              </w:rPr>
+              <w:t>Refaz as quatro consultas da aba ao mudar</w:t>
+            </w:r>
+          </w:p>
+        </w:tc>
+      </w:tr>
+      <w:tr>
+        <w:tc>
+          <w:tcPr>
+            <w:tcW w:type="dxa" w:w="100"/>
+            <w:shd w:val="clear" w:color="auto" w:fill="FFFFFF"/>
+          </w:tcPr>
+          <w:p>
+            <w:r>
+              <w:t>3</w:t>
+            </w:r>
+          </w:p>
+        </w:tc>
+        <w:tc>
+          <w:tcPr>
+            <w:tcW w:type="dxa" w:w="100"/>
+            <w:shd w:val="clear" w:color="auto" w:fill="FFFFFF"/>
+          </w:tcPr>
+          <w:p>
+            <w:r>
+              <w:t>Exportar CSV</w:t>
+            </w:r>
+          </w:p>
+        </w:tc>
+        <w:tc>
+          <w:tcPr>
+            <w:tcW w:type="dxa" w:w="100"/>
+            <w:shd w:val="clear" w:color="auto" w:fill="FFFFFF"/>
+          </w:tcPr>
+          <w:p>
+            <w:r>
+              <w:t>Gera um arquivo CSV com as contas a pagar e receber por parceiro do período</w:t>
+            </w:r>
+          </w:p>
+        </w:tc>
+        <w:tc>
+          <w:tcPr>
+            <w:tcW w:type="dxa" w:w="100"/>
+            <w:shd w:val="clear" w:color="auto" w:fill="FFFFFF"/>
+          </w:tcPr>
+          <w:p>
+            <w:r>
+              <w:t>Exportação</w:t>
+            </w:r>
+          </w:p>
+        </w:tc>
+        <w:tc>
+          <w:tcPr>
+            <w:tcW w:type="dxa" w:w="100"/>
+            <w:shd w:val="clear" w:color="auto" w:fill="FFFFFF"/>
+          </w:tcPr>
+          <w:p>
+            <w:r>
+              <w:t>—</w:t>
+            </w:r>
+          </w:p>
+        </w:tc>
+        <w:tc>
+          <w:tcPr>
+            <w:tcW w:type="dxa" w:w="100"/>
+            <w:shd w:val="clear" w:color="auto" w:fill="FFFFFF"/>
+          </w:tcPr>
+          <w:p>
+            <w:r>
+              <w:t>Gerado no navegador, a partir dos dados já carregados</w:t>
+            </w:r>
+          </w:p>
+        </w:tc>
+      </w:tr>
+      <w:tr>
+        <w:tc>
+          <w:tcPr>
+            <w:tcW w:type="dxa" w:w="100"/>
+            <w:shd w:val="clear" w:color="auto" w:fill="F2F5F0"/>
+          </w:tcPr>
+          <w:p>
+            <w:r>
+              <w:t>4</w:t>
+            </w:r>
+          </w:p>
+        </w:tc>
+        <w:tc>
+          <w:tcPr>
+            <w:tcW w:type="dxa" w:w="100"/>
+            <w:shd w:val="clear" w:color="auto" w:fill="F2F5F0"/>
+          </w:tcPr>
+          <w:p>
+            <w:r>
+              <w:t>Exportar PDF</w:t>
+            </w:r>
+          </w:p>
+        </w:tc>
+        <w:tc>
+          <w:tcPr>
+            <w:tcW w:type="dxa" w:w="100"/>
+            <w:shd w:val="clear" w:color="auto" w:fill="F2F5F0"/>
+          </w:tcPr>
+          <w:p>
+            <w:r>
+              <w:t>Gera um relatório em PDF com as três seções (contas por parceiro, produtos mais vendidos e maiores gastos) do período</w:t>
+            </w:r>
+          </w:p>
+        </w:tc>
+        <w:tc>
+          <w:tcPr>
+            <w:tcW w:type="dxa" w:w="100"/>
+            <w:shd w:val="clear" w:color="auto" w:fill="F2F5F0"/>
+          </w:tcPr>
+          <w:p>
+            <w:r>
+              <w:t>Exportação</w:t>
+            </w:r>
+          </w:p>
+        </w:tc>
+        <w:tc>
+          <w:tcPr>
+            <w:tcW w:type="dxa" w:w="100"/>
+            <w:shd w:val="clear" w:color="auto" w:fill="F2F5F0"/>
+          </w:tcPr>
+          <w:p>
+            <w:r>
+              <w:t>—</w:t>
+            </w:r>
+          </w:p>
+        </w:tc>
+        <w:tc>
+          <w:tcPr>
+            <w:tcW w:type="dxa" w:w="100"/>
+            <w:shd w:val="clear" w:color="auto" w:fill="F2F5F0"/>
+          </w:tcPr>
+          <w:p>
+            <w:r>
+              <w:t>GET /api/financeiro/rentabilidade/pdf</w:t>
             </w:r>
           </w:p>
         </w:tc>
@@ -29647,7 +30372,7 @@
         <w:spacing w:after="160"/>
       </w:pPr>
       <w:r>
-        <w:t xml:space="preserve">A tela consolida o resultado financeiro mensal da fazenda (DRE), somando automaticamente todos os lançamentos gerados pelos demais módulos (compras, folha de pagamento, consumo de estoque, vendas e perdas de alimentação), além de permitir lançamentos manuais para casos não cobertos pelos fluxos automáticos.</w:t>
+        <w:t>A aba Rentabilidade consolida o resultado financeiro do período selecionado (DRE), somando automaticamente todos os lançamentos gerados pelos demais módulos (compras, folha de pagamento, consumo de estoque, vendas e perdas de alimentação), além de permitir lançamentos manuais para casos não cobertos pelos fluxos automáticos. Abaixo do resumo, a tela também mostra as contas a pagar e receber resumidas por parceiro, os produtos mais vendidos no período (raças de animal e leite) e os maiores grupos de gasto — todos dentro do mesmo filtro de período, exportáveis em CSV ou PDF.</w:t>
       </w:r>
     </w:p>
     <w:p>
@@ -29692,7 +30417,7 @@
         <w:spacing w:after="80"/>
       </w:pPr>
       <w:r>
-        <w:t xml:space="preserve">O usuário acessa Financeiro → Dashboard.</w:t>
+        <w:t>O usuário acessa Financeiro → Rentabilidade e ajusta o filtro de período (data de início e fim).</w:t>
       </w:r>
     </w:p>
     <w:p>
@@ -29705,7 +30430,7 @@
         <w:spacing w:after="80"/>
       </w:pPr>
       <w:r>
-        <w:t xml:space="preserve">O sistema exibe o resumo mensal (entradas, saídas, resultado) e o gráfico de evolução.</w:t>
+        <w:t>O sistema exibe o resumo do período (entradas, saídas, resultado), o gráfico de evolução mensal, as contas a pagar e receber por parceiro, os produtos mais vendidos e os maiores gastos por grupo.</w:t>
       </w:r>
     </w:p>
     <w:p>
@@ -29718,7 +30443,23 @@
         <w:spacing w:after="80"/>
       </w:pPr>
       <w:r>
-        <w:t xml:space="preserve">O usuário pode filtrar por período ou lançar um registro manual.</w:t>
+        <w:t>O usuário pode lançar um registro manual (fora do fluxo automático).</w:t>
+      </w:r>
+    </w:p>
+    <w:p>
+      <w:pPr>
+        <w:pStyle w:val="ListParagraph"/>
+        <w:numPr>
+          <w:ilvl w:val="0"/>
+          <w:numId w:val="2"/>
+        </w:numPr>
+        <w:spacing w:after="80"/>
+      </w:pPr>
+      <w:r>
+        <w:rPr>
+          <w:b w:val="0"/>
+        </w:rPr>
+        <w:t>O usuário exporta os dados em CSV (contas por parceiro) ou PDF (relatório completo), respeitando o período selecionado.</w:t>
       </w:r>
     </w:p>
     <w:p>
@@ -29759,7 +30500,30 @@
         <w:t xml:space="preserve">virtual</w:t>
       </w:r>
       <w:r>
-        <w:t xml:space="preserve"> (projeção, não efetivado); o dashboard deve diferenciá-los dos lançamentos reais.</w:t>
+        <w:t xml:space="preserve"> (projeção, não efetivado); a aba Rentabilidade deve diferenciá-los dos lançamentos reais.</w:t>
+      </w:r>
+    </w:p>
+    <w:p>
+      <w:pPr>
+        <w:pStyle w:val="ListParagraph"/>
+        <w:numPr>
+          <w:ilvl w:val="0"/>
+          <w:numId w:val="1"/>
+        </w:numPr>
+        <w:spacing w:after="80"/>
+      </w:pPr>
+      <w:r>
+        <w:rPr>
+          <w:b/>
+          <w:bCs/>
+        </w:rPr>
+        <w:t xml:space="preserve">SF02: Nenhuma conta com vencimento no período — </w:t>
+      </w:r>
+      <w:r>
+        <w:rPr>
+          <w:b w:val="0"/>
+        </w:rPr>
+        <w:t>A lista de Contas a Pagar e Receber por Parceiro é exibida vazia, sem impedir a consulta das demais seções (DRE, produtos mais vendidos, maiores gastos).</w:t>
       </w:r>
     </w:p>
     <w:p>

</xml_diff>